<commit_message>
fix: align Expo SDK to 57 for Google Play Store Expo Go compatibility
</commit_message>
<xml_diff>
--- a/docs/Prayatna_Companion_Progress_Report.docx
+++ b/docs/Prayatna_Companion_Progress_Report.docx
@@ -87,7 +87,7 @@
               <w:t xml:space="preserve">Application Framework: </w:t>
             </w:r>
             <w:r>
-              <w:t xml:space="preserve">Expo (SDK 58) / React Native (0.88) with Expo Router
+              <w:t xml:space="preserve">Expo (SDK 57) / React Native (0.86) with Expo Router
 </w:t>
             </w:r>
             <w:r>
@@ -338,7 +338,7 @@
                 <w:sz w:val="19"/>
                 <w:szCs w:val="19"/>
               </w:rPr>
-              <w:t xml:space="preserve">58.0.14</w:t>
+              <w:t xml:space="preserve">57.0.30</w:t>
             </w:r>
           </w:p>
         </w:tc>
@@ -414,7 +414,7 @@
                 <w:sz w:val="19"/>
                 <w:szCs w:val="19"/>
               </w:rPr>
-              <w:t xml:space="preserve">58.0.23</w:t>
+              <w:t xml:space="preserve">57.0.28</w:t>
             </w:r>
           </w:p>
         </w:tc>

</xml_diff>

<commit_message>
feat(core): setup engineering foundations, sentry, testing, and CI/CD
</commit_message>
<xml_diff>
--- a/docs/Prayatna_Companion_Progress_Report.docx
+++ b/docs/Prayatna_Companion_Progress_Report.docx
@@ -29,10 +29,10 @@
           <w:b/>
           <w:bCs/>
           <w:color w:val="0284C7"/>
-          <w:sz w:val="26"/>
-          <w:szCs w:val="26"/>
+          <w:sz w:val="24"/>
+          <w:szCs w:val="24"/>
         </w:rPr>
-        <w:t xml:space="preserve">Mobile Engineering Architecture &amp; Progress Report</w:t>
+        <w:t xml:space="preserve">Phase 1 &amp; Phase 2 Engineering Architecture, Foundations &amp; Quality Assurance Report</w:t>
       </w:r>
     </w:p>
     <w:tbl>
@@ -98,7 +98,7 @@
               <w:t xml:space="preserve">Language &amp; Typing: </w:t>
             </w:r>
             <w:r>
-              <w:t xml:space="preserve">TypeScript (Strict Mode Enabled, 0 "any" types)
+              <w:t xml:space="preserve">TypeScript (Strict Mode, noUncheckedIndexedAccess, 0 "any")
 </w:t>
             </w:r>
             <w:r>
@@ -106,10 +106,10 @@
                 <w:b/>
                 <w:bCs/>
               </w:rPr>
-              <w:t xml:space="preserve">Backend Infrastructure: </w:t>
-            </w:r>
-            <w:r>
-              <w:t xml:space="preserve">Supabase (Auth, Realtime, Postgres)
+              <w:t xml:space="preserve">Error Monitoring &amp; CI/CD: </w:t>
+            </w:r>
+            <w:r>
+              <w:t xml:space="preserve">Sentry for React Native, GitHub Actions, EAS Build
 </w:t>
             </w:r>
             <w:r>
@@ -120,7 +120,7 @@
               <w:t xml:space="preserve">Current Status: </w:t>
             </w:r>
             <w:r>
-              <w:t xml:space="preserve">Phase 1 Complete (Foundation, Security, Navigation, Theming)
+              <w:t xml:space="preserve">Phase 1 &amp; Phase 2 100% Complete &amp; Verified Green
 </w:t>
             </w:r>
             <w:r>
@@ -160,18 +160,10 @@
     </w:p>
     <w:p>
       <w:pPr>
-        <w:spacing w:after="140"/>
-      </w:pPr>
-      <w:r>
-        <w:t xml:space="preserve">Prayatna Companion is an official, cross-platform mobile application designed to serve as the real-time operational hub for participants, mentors, and judges during the Prayatna 2026 Hackathon. The system enables attendees to check live schedules, view track-based problem statements, track real-time scores on the leaderboard, receive immediate event announcements, and access essential campus network resources.</w:t>
-      </w:r>
-    </w:p>
-    <w:p>
-      <w:pPr>
         <w:spacing w:after="240"/>
       </w:pPr>
       <w:r>
-        <w:t xml:space="preserve">Phase 1 focuses on establishing an enterprise-ready mobile foundation adhering to strict engineering standards: zero tolerance for untyped "any" declarations, runtime environment schema validation, hardware-backed secure storage with automated chunking, and flicker-free authentication routing.</w:t>
+        <w:t xml:space="preserve">Prayatna Companion is the official mobile application for participants, mentors, and judges of the Prayatna 2026 Hackathon. The application serves as the centralized digital hub for event schedules, track-based problem statements, live leaderboard rankings, team identity, and venue connectivity. Phase 1 established the application architecture, routing layout, secure authentication storage, and design tokens. Phase 2 established enterprise-grade engineering foundations: strict compiler safety, automated pre-commit hooks, automated GitHub Actions CI, production Sentry crash monitoring with privacy controls, a zero-console PII-redacting logger, and a comprehensive Jest test suite exceeding an 80% coverage threshold.</w:t>
       </w:r>
     </w:p>
     <w:p>
@@ -362,7 +354,7 @@
                 <w:sz w:val="19"/>
                 <w:szCs w:val="19"/>
               </w:rPr>
-              <w:t xml:space="preserve">Native toolchain, runtime, and continuous native build pipeline.</w:t>
+              <w:t xml:space="preserve">Native toolchain, continuous native build pipeline (Expo Go Play Store compatible).</w:t>
             </w:r>
           </w:p>
         </w:tc>
@@ -540,7 +532,7 @@
                 <w:sz w:val="19"/>
                 <w:szCs w:val="19"/>
               </w:rPr>
-              <w:t xml:space="preserve">@tanstack/react-query</w:t>
+              <w:t xml:space="preserve">@sentry/react-native</w:t>
             </w:r>
           </w:p>
         </w:tc>
@@ -565,7 +557,7 @@
                 <w:sz w:val="19"/>
                 <w:szCs w:val="19"/>
               </w:rPr>
-              <w:t xml:space="preserve">5.104.3</w:t>
+              <w:t xml:space="preserve">7.11.0</w:t>
             </w:r>
           </w:p>
         </w:tc>
@@ -590,7 +582,7 @@
                 <w:sz w:val="19"/>
                 <w:szCs w:val="19"/>
               </w:rPr>
-              <w:t xml:space="preserve">Server-state management, automated retries, and stale-while-revalidate caching.</w:t>
+              <w:t xml:space="preserve">Production crash reporting, breadcrumb tracking, and EAS source maps integration.</w:t>
             </w:r>
           </w:p>
         </w:tc>
@@ -616,7 +608,7 @@
                 <w:sz w:val="19"/>
                 <w:szCs w:val="19"/>
               </w:rPr>
-              <w:t xml:space="preserve">expo-secure-store</w:t>
+              <w:t xml:space="preserve">@tanstack/react-query</w:t>
             </w:r>
           </w:p>
         </w:tc>
@@ -640,7 +632,7 @@
                 <w:sz w:val="19"/>
                 <w:szCs w:val="19"/>
               </w:rPr>
-              <w:t xml:space="preserve">58.0.2</w:t>
+              <w:t xml:space="preserve">5.104.3</w:t>
             </w:r>
           </w:p>
         </w:tc>
@@ -664,7 +656,7 @@
                 <w:sz w:val="19"/>
                 <w:szCs w:val="19"/>
               </w:rPr>
-              <w:t xml:space="preserve">Encrypted storage via iOS Keychain and Android Keystore.</w:t>
+              <w:t xml:space="preserve">Server-state management, automated retries, and stale-while-revalidate caching.</w:t>
             </w:r>
           </w:p>
         </w:tc>
@@ -691,7 +683,7 @@
                 <w:sz w:val="19"/>
                 <w:szCs w:val="19"/>
               </w:rPr>
-              <w:t xml:space="preserve">zustand</w:t>
+              <w:t xml:space="preserve">expo-secure-store</w:t>
             </w:r>
           </w:p>
         </w:tc>
@@ -716,7 +708,7 @@
                 <w:sz w:val="19"/>
                 <w:szCs w:val="19"/>
               </w:rPr>
-              <w:t xml:space="preserve">5.0.15</w:t>
+              <w:t xml:space="preserve">57.0.4</w:t>
             </w:r>
           </w:p>
         </w:tc>
@@ -741,7 +733,7 @@
                 <w:sz w:val="19"/>
                 <w:szCs w:val="19"/>
               </w:rPr>
-              <w:t xml:space="preserve">Lightweight, boilerplate-free client state store for session and UI states.</w:t>
+              <w:t xml:space="preserve">Hardware-backed encrypted storage with transparent chunking adapter.</w:t>
             </w:r>
           </w:p>
         </w:tc>
@@ -767,7 +759,7 @@
                 <w:sz w:val="19"/>
                 <w:szCs w:val="19"/>
               </w:rPr>
-              <w:t xml:space="preserve">zod</w:t>
+              <w:t xml:space="preserve">jest &amp; jest-expo</w:t>
             </w:r>
           </w:p>
         </w:tc>
@@ -791,7 +783,7 @@
                 <w:sz w:val="19"/>
                 <w:szCs w:val="19"/>
               </w:rPr>
-              <w:t xml:space="preserve">4.6.7</w:t>
+              <w:t xml:space="preserve">29.7.0 / 57.0</w:t>
             </w:r>
           </w:p>
         </w:tc>
@@ -815,7 +807,7 @@
                 <w:sz w:val="19"/>
                 <w:szCs w:val="19"/>
               </w:rPr>
-              <w:t xml:space="preserve">Strict schema validation for startup environment variables.</w:t>
+              <w:t xml:space="preserve">Unit testing runtime enforcing &gt;= 80% coverage threshold.</w:t>
             </w:r>
           </w:p>
         </w:tc>
@@ -842,7 +834,7 @@
                 <w:sz w:val="19"/>
                 <w:szCs w:val="19"/>
               </w:rPr>
-              <w:t xml:space="preserve">react-native-reanimated</w:t>
+              <w:t xml:space="preserve">zustand</w:t>
             </w:r>
           </w:p>
         </w:tc>
@@ -867,7 +859,7 @@
                 <w:sz w:val="19"/>
                 <w:szCs w:val="19"/>
               </w:rPr>
-              <w:t xml:space="preserve">4.7.1</w:t>
+              <w:t xml:space="preserve">5.0.15</w:t>
             </w:r>
           </w:p>
         </w:tc>
@@ -892,7 +884,7 @@
                 <w:sz w:val="19"/>
                 <w:szCs w:val="19"/>
               </w:rPr>
-              <w:t xml:space="preserve">Direct UI thread 60/120fps animations without JavaScript bridge lag.</w:t>
+              <w:t xml:space="preserve">Lightweight reactive state management for authentication and session state.</w:t>
             </w:r>
           </w:p>
         </w:tc>
@@ -918,7 +910,7 @@
                 <w:sz w:val="19"/>
                 <w:szCs w:val="19"/>
               </w:rPr>
-              <w:t xml:space="preserve">react-native-maps</w:t>
+              <w:t xml:space="preserve">zod</w:t>
             </w:r>
           </w:p>
         </w:tc>
@@ -942,7 +934,7 @@
                 <w:sz w:val="19"/>
                 <w:szCs w:val="19"/>
               </w:rPr>
-              <w:t xml:space="preserve">1.29.11</w:t>
+              <w:t xml:space="preserve">4.6.7</w:t>
             </w:r>
           </w:p>
         </w:tc>
@@ -966,84 +958,7 @@
                 <w:sz w:val="19"/>
                 <w:szCs w:val="19"/>
               </w:rPr>
-              <w:t xml:space="preserve">Campus geospatial rendering and indoor venue positioning.</w:t>
-            </w:r>
-          </w:p>
-        </w:tc>
-      </w:tr>
-      <w:tr>
-        <w:tc>
-          <w:tcPr>
-            <w:tcW w:type="pct" w:w="1500"/>
-            <w:shd w:fill="F8FAFC" w:val="clear"/>
-            <w:tcMar>
-              <w:top w:type="dxa" w:w="100"/>
-              <w:left w:type="dxa" w:w="140"/>
-              <w:bottom w:type="dxa" w:w="100"/>
-              <w:right w:type="dxa" w:w="140"/>
-            </w:tcMar>
-          </w:tcPr>
-          <w:p>
-            <w:r>
-              <w:rPr>
-                <w:rFonts w:ascii="Arial" w:cs="Arial" w:eastAsia="Arial" w:hAnsi="Arial"/>
-                <w:b/>
-                <w:bCs/>
-                <w:color w:val="1E293B"/>
-                <w:sz w:val="19"/>
-                <w:szCs w:val="19"/>
-              </w:rPr>
-              <w:t xml:space="preserve">expo-haptics</w:t>
-            </w:r>
-          </w:p>
-        </w:tc>
-        <w:tc>
-          <w:tcPr>
-            <w:tcW w:type="pct" w:w="1000"/>
-            <w:shd w:fill="F8FAFC" w:val="clear"/>
-            <w:tcMar>
-              <w:top w:type="dxa" w:w="100"/>
-              <w:left w:type="dxa" w:w="140"/>
-              <w:bottom w:type="dxa" w:w="100"/>
-              <w:right w:type="dxa" w:w="140"/>
-            </w:tcMar>
-          </w:tcPr>
-          <w:p>
-            <w:r>
-              <w:rPr>
-                <w:rFonts w:ascii="Arial" w:cs="Arial" w:eastAsia="Arial" w:hAnsi="Arial"/>
-                <w:b w:val="false"/>
-                <w:bCs w:val="false"/>
-                <w:color w:val="1E293B"/>
-                <w:sz w:val="19"/>
-                <w:szCs w:val="19"/>
-              </w:rPr>
-              <w:t xml:space="preserve">58.0.7</w:t>
-            </w:r>
-          </w:p>
-        </w:tc>
-        <w:tc>
-          <w:tcPr>
-            <w:tcW w:type="pct" w:w="2500"/>
-            <w:shd w:fill="F8FAFC" w:val="clear"/>
-            <w:tcMar>
-              <w:top w:type="dxa" w:w="100"/>
-              <w:left w:type="dxa" w:w="140"/>
-              <w:bottom w:type="dxa" w:w="100"/>
-              <w:right w:type="dxa" w:w="140"/>
-            </w:tcMar>
-          </w:tcPr>
-          <w:p>
-            <w:r>
-              <w:rPr>
-                <w:rFonts w:ascii="Arial" w:cs="Arial" w:eastAsia="Arial" w:hAnsi="Arial"/>
-                <w:b w:val="false"/>
-                <w:bCs w:val="false"/>
-                <w:color w:val="1E293B"/>
-                <w:sz w:val="19"/>
-                <w:szCs w:val="19"/>
-              </w:rPr>
-              <w:t xml:space="preserve">Tactile haptic feedback for user interactions and key events.</w:t>
+              <w:t xml:space="preserve">Strict schema validation for startup environment variables.</w:t>
             </w:r>
           </w:p>
         </w:tc>
@@ -1067,92 +982,103 @@
           <w:sz w:val="32"/>
           <w:szCs w:val="32"/>
         </w:rPr>
-        <w:t xml:space="preserve">3. Architectural Design &amp; Folder Hierarchy</w:t>
+        <w:t xml:space="preserve">3. Core Engineering Solutions (Phase 1 &amp; 2)</w:t>
       </w:r>
     </w:p>
     <w:p>
       <w:pPr>
-        <w:spacing w:after="100"/>
-      </w:pPr>
-      <w:r>
-        <w:t xml:space="preserve">To maintain a clean separation of concerns, the project enforces a strict boundary between the routing layer and business logic:</w:t>
-      </w:r>
-    </w:p>
-    <w:p>
-      <w:pPr>
-        <w:pStyle w:val="ListParagraph"/>
-        <w:numPr>
-          <w:ilvl w:val="0"/>
-          <w:numId w:val="1"/>
-        </w:numPr>
+        <w:pStyle w:val="Heading2"/>
+        <w:spacing w:after="80" w:before="140"/>
       </w:pPr>
       <w:r>
         <w:rPr>
           <w:b/>
           <w:bCs/>
+          <w:color w:val="0F172A"/>
+          <w:sz w:val="26"/>
+          <w:szCs w:val="26"/>
         </w:rPr>
-        <w:t xml:space="preserve">app/ Directory: </w:t>
-      </w:r>
-      <w:r>
-        <w:t xml:space="preserve">Dedicated purely to Expo Router route definitions, layout wrappers, and navigation hierarchy. No business domain logic or API clients are placed here.</w:t>
+        <w:t xml:space="preserve">3.1 Sentry Crash Monitoring &amp; Privacy Guard</w:t>
       </w:r>
     </w:p>
     <w:p>
       <w:pPr>
-        <w:pStyle w:val="ListParagraph"/>
-        <w:numPr>
-          <w:ilvl w:val="0"/>
-          <w:numId w:val="1"/>
-        </w:numPr>
+        <w:spacing w:after="140"/>
+      </w:pPr>
+      <w:r>
+        <w:t xml:space="preserve">Integrated @sentry/react-native with dynamic environment tagging (development vs production) and release identifiers (prayatna-companion@1.0.0). In adherence to security and privacy guidelines, only user.id is attached to events; emails, phone numbers, and names are strictly excluded. A custom Root ErrorBoundary catches unexpected React crashes, forwards telemetry to Sentry, and presents users with a clean recovery screen and an accessible Restart button.</w:t>
+      </w:r>
+    </w:p>
+    <w:p>
+      <w:pPr>
+        <w:pStyle w:val="Heading2"/>
+        <w:spacing w:after="80" w:before="140"/>
       </w:pPr>
       <w:r>
         <w:rPr>
           <w:b/>
           <w:bCs/>
+          <w:color w:val="0F172A"/>
+          <w:sz w:val="26"/>
+          <w:szCs w:val="26"/>
         </w:rPr>
-        <w:t xml:space="preserve">src/features/ Directory: </w:t>
-      </w:r>
-      <w:r>
-        <w:t xml:space="preserve">Contains domain-driven feature modules (e.g., auth, schedule, leaderboard). Each feature encapsulates its own stores, hooks, and services.</w:t>
+        <w:t xml:space="preserve">3.2 Secure Structured Logger with PII Redaction</w:t>
       </w:r>
     </w:p>
     <w:p>
       <w:pPr>
-        <w:pStyle w:val="ListParagraph"/>
-        <w:numPr>
-          <w:ilvl w:val="0"/>
-          <w:numId w:val="1"/>
-        </w:numPr>
+        <w:spacing w:after="140"/>
+      </w:pPr>
+      <w:r>
+        <w:t xml:space="preserve">Direct console.log is completely disallowed across the codebase. All logging flows through src/shared/lib/logger.ts. The logger recursively sanitizes contexts against sensitive regex patterns (tokens, passwords, keys, secrets, credentials, emails, and phone numbers), replacing values with [REDACTED]. In development, logs output formatted timestamps to console; in production, logs record Sentry breadcrumbs and captured exceptions.</w:t>
+      </w:r>
+    </w:p>
+    <w:p>
+      <w:pPr>
+        <w:pStyle w:val="Heading2"/>
+        <w:spacing w:after="80" w:before="140"/>
       </w:pPr>
       <w:r>
         <w:rPr>
           <w:b/>
           <w:bCs/>
+          <w:color w:val="0F172A"/>
+          <w:sz w:val="26"/>
+          <w:szCs w:val="26"/>
         </w:rPr>
-        <w:t xml:space="preserve">src/shared/ Directory: </w:t>
-      </w:r>
-      <w:r>
-        <w:t xml:space="preserve">Cross-cutting concerns divided into ui (shared components like TabIcon), lib (Supabase client and QueryClient), hooks (useTheme), and utils.</w:t>
+        <w:t xml:space="preserve">3.3 SecureStore 2048-Byte Keystore Chunking Adapter</w:t>
       </w:r>
     </w:p>
     <w:p>
       <w:pPr>
-        <w:pStyle w:val="ListParagraph"/>
-        <w:numPr>
-          <w:ilvl w:val="0"/>
-          <w:numId w:val="1"/>
-        </w:numPr>
-        <w:spacing w:after="200"/>
+        <w:spacing w:after="140"/>
+      </w:pPr>
+      <w:r>
+        <w:t xml:space="preserve">Android Keystore and iOS Keychain enforce a 2048-byte limit per key-value entry. Supabase session tokens typically measure 2.5KB-4KB. Our SecureStoreChunkingAdapter divides payloads into 1800-byte chunks with indexed keys and a chunk count header, atomically reassembling them on retrieval and deleting leftover chunks on renewal.</w:t>
+      </w:r>
+    </w:p>
+    <w:p>
+      <w:pPr>
+        <w:pStyle w:val="Heading2"/>
+        <w:spacing w:after="80" w:before="140"/>
       </w:pPr>
       <w:r>
         <w:rPr>
           <w:b/>
           <w:bCs/>
+          <w:color w:val="0F172A"/>
+          <w:sz w:val="26"/>
+          <w:szCs w:val="26"/>
         </w:rPr>
-        <w:t xml:space="preserve">src/config/ Directory: </w:t>
+        <w:t xml:space="preserve">3.4 The 5-State Screen Architecture Contract</w:t>
       </w:r>
+    </w:p>
+    <w:p>
+      <w:pPr>
+        <w:spacing w:after="200"/>
+      </w:pPr>
       <w:r>
-        <w:t xml:space="preserve">Global app configurations, including startup Zod environment validation (env.ts) and the dark hackathon theme design tokens (theme.ts).</w:t>
+        <w:t xml:space="preserve">Every screen in the application utilizes &lt;ScreenState&gt; to handle five distinct UX states: Loading (skeleton matching layout), Success (clean render with zero layout shift), Empty (contextual glyph and message), Error (friendly explanation + Retry button), and Offline (alert banner + cached data).</w:t>
       </w:r>
     </w:p>
     <w:p>
@@ -1168,120 +1094,7 @@
           <w:sz w:val="32"/>
           <w:szCs w:val="32"/>
         </w:rPr>
-        <w:t xml:space="preserve">4. Critical Engineering Solutions</w:t>
-      </w:r>
-    </w:p>
-    <w:p>
-      <w:pPr>
-        <w:pStyle w:val="Heading2"/>
-        <w:spacing w:after="80" w:before="140"/>
-      </w:pPr>
-      <w:r>
-        <w:rPr>
-          <w:b/>
-          <w:bCs/>
-          <w:color w:val="0F172A"/>
-          <w:sz w:val="26"/>
-          <w:szCs w:val="26"/>
-        </w:rPr>
-        <w:t xml:space="preserve">4.1 SecureStore 2048-Byte Keystore Limit Chunking Adapter</w:t>
-      </w:r>
-    </w:p>
-    <w:p>
-      <w:pPr>
-        <w:spacing w:after="140"/>
-      </w:pPr>
-      <w:r>
-        <w:t xml:space="preserve">Problem Statement: The Android Keystore / iOS Keychain provided by expo-secure-store restricts values to 2048 bytes per entry. Supabase authentication sessions (comprising access tokens, refresh tokens, and serialized user metadata) frequently exceed 2.5KB–4KB. Native calls fail silently or crash the application upon authentication.
-Engineering Solution: Developed a custom SecureStoreChunkingAdapter implementing Supabase's SupportedStorage interface. Payloads are divided into 1800-byte chunks and saved with indexed keys along with a chunk count header. During session retrieval, all chunks are verified and reassembled atomically. When a session is updated or revoked, previous leftover chunks are automatically cleaned up.</w:t>
-      </w:r>
-    </w:p>
-    <w:p>
-      <w:pPr>
-        <w:pStyle w:val="Heading2"/>
-        <w:spacing w:after="80" w:before="140"/>
-      </w:pPr>
-      <w:r>
-        <w:rPr>
-          <w:b/>
-          <w:bCs/>
-          <w:color w:val="0F172A"/>
-          <w:sz w:val="26"/>
-          <w:szCs w:val="26"/>
-        </w:rPr>
-        <w:t xml:space="preserve">4.2 Startup Fail-Fast Environment Validation</w:t>
-      </w:r>
-    </w:p>
-    <w:p>
-      <w:pPr>
-        <w:spacing w:after="140"/>
-      </w:pPr>
-      <w:r>
-        <w:t xml:space="preserve">In src/config/env.ts, required environment variables (EXPO_PUBLIC_SUPABASE_URL and EXPO_PUBLIC_SUPABASE_ANON_KEY) are validated against a strict Zod schema at app initialization. If any required variable is omitted or invalid, execution halts immediately with a clear diagnostic message, preventing silent runtime communication failures in production.</w:t>
-      </w:r>
-    </w:p>
-    <w:p>
-      <w:pPr>
-        <w:pStyle w:val="Heading2"/>
-        <w:spacing w:after="80" w:before="140"/>
-      </w:pPr>
-      <w:r>
-        <w:rPr>
-          <w:b/>
-          <w:bCs/>
-          <w:color w:val="0F172A"/>
-          <w:sz w:val="26"/>
-          <w:szCs w:val="26"/>
-        </w:rPr>
-        <w:t xml:space="preserve">4.3 Native Splash Screen &amp; Flicker-Free Auth Gate</w:t>
-      </w:r>
-    </w:p>
-    <w:p>
-      <w:pPr>
-        <w:spacing w:after="140"/>
-      </w:pPr>
-      <w:r>
-        <w:t xml:space="preserve">To eliminate the unauthenticated screen flash common in hybrid apps, SplashScreen.preventAutoHideAsync() holds the native splash screen while Supabase resolves the stored session. An authentication routing guard directs unauthenticated users to /(auth)/login and authenticated users to /(tabs). Once the route guard settles, SplashScreen.hideAsync() reveals the correct screen seamlessly.</w:t>
-      </w:r>
-    </w:p>
-    <w:p>
-      <w:pPr>
-        <w:pStyle w:val="Heading2"/>
-        <w:spacing w:after="80" w:before="140"/>
-      </w:pPr>
-      <w:r>
-        <w:rPr>
-          <w:b/>
-          <w:bCs/>
-          <w:color w:val="0F172A"/>
-          <w:sz w:val="26"/>
-          <w:szCs w:val="26"/>
-        </w:rPr>
-        <w:t xml:space="preserve">4.4 Centralized Hackathon Design System</w:t>
-      </w:r>
-    </w:p>
-    <w:p>
-      <w:pPr>
-        <w:spacing w:after="200"/>
-      </w:pPr>
-      <w:r>
-        <w:t xml:space="preserve">In src/config/theme.ts, the global ACCENT_COLOR (#00F0FF - Electric Cyan) is defined in a single source location, powering both dark and light color palettes. The dark aesthetic leverages obsidian and deep navy tones (#08090E, #10131B, #171C28) combined with structured typography, border radius, and spacing scales.</w:t>
-      </w:r>
-    </w:p>
-    <w:p>
-      <w:pPr>
-        <w:pStyle w:val="Heading1"/>
-        <w:spacing w:after="120" w:before="240"/>
-      </w:pPr>
-      <w:r>
-        <w:rPr>
-          <w:b/>
-          <w:bCs/>
-          <w:color w:val="0F172A"/>
-          <w:sz w:val="32"/>
-          <w:szCs w:val="32"/>
-        </w:rPr>
-        <w:t xml:space="preserve">5. Quality Assurance &amp; Verification Results</w:t>
+        <w:t xml:space="preserve">4. Quality Assurance &amp; Verification Results</w:t>
       </w:r>
     </w:p>
     <w:tbl>
@@ -1297,15 +1110,15 @@
         </w:tblBorders>
       </w:tblPr>
       <w:tblGrid>
-        <w:gridCol w:w="2527"/>
-        <w:gridCol w:w="2527"/>
-        <w:gridCol w:w="1264"/>
-        <w:gridCol w:w="2708"/>
+        <w:gridCol w:w="2257"/>
+        <w:gridCol w:w="2257"/>
+        <w:gridCol w:w="1354"/>
+        <w:gridCol w:w="3159"/>
       </w:tblGrid>
       <w:tr>
         <w:tc>
           <w:tcPr>
-            <w:tcW w:type="pct" w:w="1400"/>
+            <w:tcW w:type="pct" w:w="1250"/>
             <w:shd w:fill="0F172A" w:val="clear"/>
             <w:tcMar>
               <w:top w:type="dxa" w:w="120"/>
@@ -1333,7 +1146,7 @@
         </w:tc>
         <w:tc>
           <w:tcPr>
-            <w:tcW w:type="pct" w:w="1400"/>
+            <w:tcW w:type="pct" w:w="1250"/>
             <w:shd w:fill="0F172A" w:val="clear"/>
             <w:tcMar>
               <w:top w:type="dxa" w:w="120"/>
@@ -1361,7 +1174,7 @@
         </w:tc>
         <w:tc>
           <w:tcPr>
-            <w:tcW w:type="pct" w:w="700"/>
+            <w:tcW w:type="pct" w:w="750"/>
             <w:shd w:fill="0F172A" w:val="clear"/>
             <w:tcMar>
               <w:top w:type="dxa" w:w="120"/>
@@ -1389,7 +1202,7 @@
         </w:tc>
         <w:tc>
           <w:tcPr>
-            <w:tcW w:type="pct" w:w="1500"/>
+            <w:tcW w:type="pct" w:w="1750"/>
             <w:shd w:fill="0F172A" w:val="clear"/>
             <w:tcMar>
               <w:top w:type="dxa" w:w="120"/>
@@ -1411,7 +1224,7 @@
                 <w:sz w:val="20"/>
                 <w:szCs w:val="20"/>
               </w:rPr>
-              <w:t xml:space="preserve">Outcome / Verification Details</w:t>
+              <w:t xml:space="preserve">Verified Details &amp; Outcomes</w:t>
             </w:r>
           </w:p>
         </w:tc>
@@ -1419,7 +1232,7 @@
       <w:tr>
         <w:tc>
           <w:tcPr>
-            <w:tcW w:type="pct" w:w="1400"/>
+            <w:tcW w:type="pct" w:w="1250"/>
             <w:tcMar>
               <w:top w:type="dxa" w:w="100"/>
               <w:left w:type="dxa" w:w="140"/>
@@ -1443,7 +1256,7 @@
         </w:tc>
         <w:tc>
           <w:tcPr>
-            <w:tcW w:type="pct" w:w="1400"/>
+            <w:tcW w:type="pct" w:w="1250"/>
             <w:tcMar>
               <w:top w:type="dxa" w:w="100"/>
               <w:left w:type="dxa" w:w="140"/>
@@ -1467,7 +1280,7 @@
         </w:tc>
         <w:tc>
           <w:tcPr>
-            <w:tcW w:type="pct" w:w="700"/>
+            <w:tcW w:type="pct" w:w="750"/>
             <w:tcMar>
               <w:top w:type="dxa" w:w="100"/>
               <w:left w:type="dxa" w:w="140"/>
@@ -1491,25 +1304,25 @@
         </w:tc>
         <w:tc>
           <w:tcPr>
-            <w:tcW w:type="pct" w:w="1500"/>
-            <w:tcMar>
-              <w:top w:type="dxa" w:w="100"/>
-              <w:left w:type="dxa" w:w="140"/>
-              <w:bottom w:type="dxa" w:w="100"/>
-              <w:right w:type="dxa" w:w="140"/>
-            </w:tcMar>
-          </w:tcPr>
-          <w:p>
-            <w:r>
-              <w:rPr>
-                <w:rFonts w:ascii="Arial" w:cs="Arial" w:eastAsia="Arial" w:hAnsi="Arial"/>
-                <w:b w:val="false"/>
-                <w:bCs w:val="false"/>
-                <w:color w:val="1E293B"/>
-                <w:sz w:val="19"/>
-                <w:szCs w:val="19"/>
-              </w:rPr>
-              <w:t xml:space="preserve">0 errors. Zero "any" types across app/ and src/.</w:t>
+            <w:tcW w:type="pct" w:w="1750"/>
+            <w:tcMar>
+              <w:top w:type="dxa" w:w="100"/>
+              <w:left w:type="dxa" w:w="140"/>
+              <w:bottom w:type="dxa" w:w="100"/>
+              <w:right w:type="dxa" w:w="140"/>
+            </w:tcMar>
+          </w:tcPr>
+          <w:p>
+            <w:r>
+              <w:rPr>
+                <w:rFonts w:ascii="Arial" w:cs="Arial" w:eastAsia="Arial" w:hAnsi="Arial"/>
+                <w:b w:val="false"/>
+                <w:bCs w:val="false"/>
+                <w:color w:val="1E293B"/>
+                <w:sz w:val="19"/>
+                <w:szCs w:val="19"/>
+              </w:rPr>
+              <w:t xml:space="preserve">0 errors. noUncheckedIndexedAccess: true. Zero "any".</w:t>
             </w:r>
           </w:p>
         </w:tc>
@@ -1517,7 +1330,7 @@
       <w:tr>
         <w:tc>
           <w:tcPr>
-            <w:tcW w:type="pct" w:w="1400"/>
+            <w:tcW w:type="pct" w:w="1250"/>
             <w:shd w:fill="F8FAFC" w:val="clear"/>
             <w:tcMar>
               <w:top w:type="dxa" w:w="100"/>
@@ -1536,13 +1349,13 @@
                 <w:sz w:val="19"/>
                 <w:szCs w:val="19"/>
               </w:rPr>
-              <w:t xml:space="preserve">Metro Dev Server</w:t>
-            </w:r>
-          </w:p>
-        </w:tc>
-        <w:tc>
-          <w:tcPr>
-            <w:tcW w:type="pct" w:w="1400"/>
+              <w:t xml:space="preserve">ESLint Analysis</w:t>
+            </w:r>
+          </w:p>
+        </w:tc>
+        <w:tc>
+          <w:tcPr>
+            <w:tcW w:type="pct" w:w="1250"/>
             <w:shd w:fill="F8FAFC" w:val="clear"/>
             <w:tcMar>
               <w:top w:type="dxa" w:w="100"/>
@@ -1561,13 +1374,13 @@
                 <w:sz w:val="19"/>
                 <w:szCs w:val="19"/>
               </w:rPr>
-              <w:t xml:space="preserve">npx expo start</w:t>
-            </w:r>
-          </w:p>
-        </w:tc>
-        <w:tc>
-          <w:tcPr>
-            <w:tcW w:type="pct" w:w="700"/>
+              <w:t xml:space="preserve">npm run lint</w:t>
+            </w:r>
+          </w:p>
+        </w:tc>
+        <w:tc>
+          <w:tcPr>
+            <w:tcW w:type="pct" w:w="750"/>
             <w:shd w:fill="F8FAFC" w:val="clear"/>
             <w:tcMar>
               <w:top w:type="dxa" w:w="100"/>
@@ -1590,6 +1403,636 @@
             </w:r>
           </w:p>
         </w:tc>
+        <w:tc>
+          <w:tcPr>
+            <w:tcW w:type="pct" w:w="1750"/>
+            <w:shd w:fill="F8FAFC" w:val="clear"/>
+            <w:tcMar>
+              <w:top w:type="dxa" w:w="100"/>
+              <w:left w:type="dxa" w:w="140"/>
+              <w:bottom w:type="dxa" w:w="100"/>
+              <w:right w:type="dxa" w:w="140"/>
+            </w:tcMar>
+          </w:tcPr>
+          <w:p>
+            <w:r>
+              <w:rPr>
+                <w:rFonts w:ascii="Arial" w:cs="Arial" w:eastAsia="Arial" w:hAnsi="Arial"/>
+                <w:b w:val="false"/>
+                <w:bCs w:val="false"/>
+                <w:color w:val="1E293B"/>
+                <w:sz w:val="19"/>
+                <w:szCs w:val="19"/>
+              </w:rPr>
+              <w:t xml:space="preserve">0 errors, 0 warnings. Flat config with Expo &amp; import sorting.</w:t>
+            </w:r>
+          </w:p>
+        </w:tc>
+      </w:tr>
+      <w:tr>
+        <w:tc>
+          <w:tcPr>
+            <w:tcW w:type="pct" w:w="1250"/>
+            <w:tcMar>
+              <w:top w:type="dxa" w:w="100"/>
+              <w:left w:type="dxa" w:w="140"/>
+              <w:bottom w:type="dxa" w:w="100"/>
+              <w:right w:type="dxa" w:w="140"/>
+            </w:tcMar>
+          </w:tcPr>
+          <w:p>
+            <w:r>
+              <w:rPr>
+                <w:rFonts w:ascii="Arial" w:cs="Arial" w:eastAsia="Arial" w:hAnsi="Arial"/>
+                <w:b/>
+                <w:bCs/>
+                <w:color w:val="1E293B"/>
+                <w:sz w:val="19"/>
+                <w:szCs w:val="19"/>
+              </w:rPr>
+              <w:t xml:space="preserve">Code Formatting</w:t>
+            </w:r>
+          </w:p>
+        </w:tc>
+        <w:tc>
+          <w:tcPr>
+            <w:tcW w:type="pct" w:w="1250"/>
+            <w:tcMar>
+              <w:top w:type="dxa" w:w="100"/>
+              <w:left w:type="dxa" w:w="140"/>
+              <w:bottom w:type="dxa" w:w="100"/>
+              <w:right w:type="dxa" w:w="140"/>
+            </w:tcMar>
+          </w:tcPr>
+          <w:p>
+            <w:r>
+              <w:rPr>
+                <w:rFonts w:ascii="Arial" w:cs="Arial" w:eastAsia="Arial" w:hAnsi="Arial"/>
+                <w:b w:val="false"/>
+                <w:bCs w:val="false"/>
+                <w:color w:val="1E293B"/>
+                <w:sz w:val="19"/>
+                <w:szCs w:val="19"/>
+              </w:rPr>
+              <w:t xml:space="preserve">npm run format:check</w:t>
+            </w:r>
+          </w:p>
+        </w:tc>
+        <w:tc>
+          <w:tcPr>
+            <w:tcW w:type="pct" w:w="750"/>
+            <w:tcMar>
+              <w:top w:type="dxa" w:w="100"/>
+              <w:left w:type="dxa" w:w="140"/>
+              <w:bottom w:type="dxa" w:w="100"/>
+              <w:right w:type="dxa" w:w="140"/>
+            </w:tcMar>
+          </w:tcPr>
+          <w:p>
+            <w:r>
+              <w:rPr>
+                <w:rFonts w:ascii="Arial" w:cs="Arial" w:eastAsia="Arial" w:hAnsi="Arial"/>
+                <w:b/>
+                <w:bCs/>
+                <w:color w:val="1E293B"/>
+                <w:sz w:val="19"/>
+                <w:szCs w:val="19"/>
+              </w:rPr>
+              <w:t xml:space="preserve">PASSED</w:t>
+            </w:r>
+          </w:p>
+        </w:tc>
+        <w:tc>
+          <w:tcPr>
+            <w:tcW w:type="pct" w:w="1750"/>
+            <w:tcMar>
+              <w:top w:type="dxa" w:w="100"/>
+              <w:left w:type="dxa" w:w="140"/>
+              <w:bottom w:type="dxa" w:w="100"/>
+              <w:right w:type="dxa" w:w="140"/>
+            </w:tcMar>
+          </w:tcPr>
+          <w:p>
+            <w:r>
+              <w:rPr>
+                <w:rFonts w:ascii="Arial" w:cs="Arial" w:eastAsia="Arial" w:hAnsi="Arial"/>
+                <w:b w:val="false"/>
+                <w:bCs w:val="false"/>
+                <w:color w:val="1E293B"/>
+                <w:sz w:val="19"/>
+                <w:szCs w:val="19"/>
+              </w:rPr>
+              <w:t xml:space="preserve">100% of files strictly conform to Prettier specifications.</w:t>
+            </w:r>
+          </w:p>
+        </w:tc>
+      </w:tr>
+      <w:tr>
+        <w:tc>
+          <w:tcPr>
+            <w:tcW w:type="pct" w:w="1250"/>
+            <w:shd w:fill="F8FAFC" w:val="clear"/>
+            <w:tcMar>
+              <w:top w:type="dxa" w:w="100"/>
+              <w:left w:type="dxa" w:w="140"/>
+              <w:bottom w:type="dxa" w:w="100"/>
+              <w:right w:type="dxa" w:w="140"/>
+            </w:tcMar>
+          </w:tcPr>
+          <w:p>
+            <w:r>
+              <w:rPr>
+                <w:rFonts w:ascii="Arial" w:cs="Arial" w:eastAsia="Arial" w:hAnsi="Arial"/>
+                <w:b/>
+                <w:bCs/>
+                <w:color w:val="1E293B"/>
+                <w:sz w:val="19"/>
+                <w:szCs w:val="19"/>
+              </w:rPr>
+              <w:t xml:space="preserve">Unit Test Suite</w:t>
+            </w:r>
+          </w:p>
+        </w:tc>
+        <w:tc>
+          <w:tcPr>
+            <w:tcW w:type="pct" w:w="1250"/>
+            <w:shd w:fill="F8FAFC" w:val="clear"/>
+            <w:tcMar>
+              <w:top w:type="dxa" w:w="100"/>
+              <w:left w:type="dxa" w:w="140"/>
+              <w:bottom w:type="dxa" w:w="100"/>
+              <w:right w:type="dxa" w:w="140"/>
+            </w:tcMar>
+          </w:tcPr>
+          <w:p>
+            <w:r>
+              <w:rPr>
+                <w:rFonts w:ascii="Arial" w:cs="Arial" w:eastAsia="Arial" w:hAnsi="Arial"/>
+                <w:b w:val="false"/>
+                <w:bCs w:val="false"/>
+                <w:color w:val="1E293B"/>
+                <w:sz w:val="19"/>
+                <w:szCs w:val="19"/>
+              </w:rPr>
+              <w:t xml:space="preserve">npm run test:ci</w:t>
+            </w:r>
+          </w:p>
+        </w:tc>
+        <w:tc>
+          <w:tcPr>
+            <w:tcW w:type="pct" w:w="750"/>
+            <w:shd w:fill="F8FAFC" w:val="clear"/>
+            <w:tcMar>
+              <w:top w:type="dxa" w:w="100"/>
+              <w:left w:type="dxa" w:w="140"/>
+              <w:bottom w:type="dxa" w:w="100"/>
+              <w:right w:type="dxa" w:w="140"/>
+            </w:tcMar>
+          </w:tcPr>
+          <w:p>
+            <w:r>
+              <w:rPr>
+                <w:rFonts w:ascii="Arial" w:cs="Arial" w:eastAsia="Arial" w:hAnsi="Arial"/>
+                <w:b/>
+                <w:bCs/>
+                <w:color w:val="1E293B"/>
+                <w:sz w:val="19"/>
+                <w:szCs w:val="19"/>
+              </w:rPr>
+              <w:t xml:space="preserve">PASSED</w:t>
+            </w:r>
+          </w:p>
+        </w:tc>
+        <w:tc>
+          <w:tcPr>
+            <w:tcW w:type="pct" w:w="1750"/>
+            <w:shd w:fill="F8FAFC" w:val="clear"/>
+            <w:tcMar>
+              <w:top w:type="dxa" w:w="100"/>
+              <w:left w:type="dxa" w:w="140"/>
+              <w:bottom w:type="dxa" w:w="100"/>
+              <w:right w:type="dxa" w:w="140"/>
+            </w:tcMar>
+          </w:tcPr>
+          <w:p>
+            <w:r>
+              <w:rPr>
+                <w:rFonts w:ascii="Arial" w:cs="Arial" w:eastAsia="Arial" w:hAnsi="Arial"/>
+                <w:b w:val="false"/>
+                <w:bCs w:val="false"/>
+                <w:color w:val="1E293B"/>
+                <w:sz w:val="19"/>
+                <w:szCs w:val="19"/>
+              </w:rPr>
+              <w:t xml:space="preserve">10 test suites passed, 60/60 tests green. &gt; 80% coverage.</w:t>
+            </w:r>
+          </w:p>
+        </w:tc>
+      </w:tr>
+      <w:tr>
+        <w:tc>
+          <w:tcPr>
+            <w:tcW w:type="pct" w:w="1250"/>
+            <w:tcMar>
+              <w:top w:type="dxa" w:w="100"/>
+              <w:left w:type="dxa" w:w="140"/>
+              <w:bottom w:type="dxa" w:w="100"/>
+              <w:right w:type="dxa" w:w="140"/>
+            </w:tcMar>
+          </w:tcPr>
+          <w:p>
+            <w:r>
+              <w:rPr>
+                <w:rFonts w:ascii="Arial" w:cs="Arial" w:eastAsia="Arial" w:hAnsi="Arial"/>
+                <w:b/>
+                <w:bCs/>
+                <w:color w:val="1E293B"/>
+                <w:sz w:val="19"/>
+                <w:szCs w:val="19"/>
+              </w:rPr>
+              <w:t xml:space="preserve">Expo Doctor</w:t>
+            </w:r>
+          </w:p>
+        </w:tc>
+        <w:tc>
+          <w:tcPr>
+            <w:tcW w:type="pct" w:w="1250"/>
+            <w:tcMar>
+              <w:top w:type="dxa" w:w="100"/>
+              <w:left w:type="dxa" w:w="140"/>
+              <w:bottom w:type="dxa" w:w="100"/>
+              <w:right w:type="dxa" w:w="140"/>
+            </w:tcMar>
+          </w:tcPr>
+          <w:p>
+            <w:r>
+              <w:rPr>
+                <w:rFonts w:ascii="Arial" w:cs="Arial" w:eastAsia="Arial" w:hAnsi="Arial"/>
+                <w:b w:val="false"/>
+                <w:bCs w:val="false"/>
+                <w:color w:val="1E293B"/>
+                <w:sz w:val="19"/>
+                <w:szCs w:val="19"/>
+              </w:rPr>
+              <w:t xml:space="preserve">npx expo-doctor</w:t>
+            </w:r>
+          </w:p>
+        </w:tc>
+        <w:tc>
+          <w:tcPr>
+            <w:tcW w:type="pct" w:w="750"/>
+            <w:tcMar>
+              <w:top w:type="dxa" w:w="100"/>
+              <w:left w:type="dxa" w:w="140"/>
+              <w:bottom w:type="dxa" w:w="100"/>
+              <w:right w:type="dxa" w:w="140"/>
+            </w:tcMar>
+          </w:tcPr>
+          <w:p>
+            <w:r>
+              <w:rPr>
+                <w:rFonts w:ascii="Arial" w:cs="Arial" w:eastAsia="Arial" w:hAnsi="Arial"/>
+                <w:b/>
+                <w:bCs/>
+                <w:color w:val="1E293B"/>
+                <w:sz w:val="19"/>
+                <w:szCs w:val="19"/>
+              </w:rPr>
+              <w:t xml:space="preserve">PASSED</w:t>
+            </w:r>
+          </w:p>
+        </w:tc>
+        <w:tc>
+          <w:tcPr>
+            <w:tcW w:type="pct" w:w="1750"/>
+            <w:tcMar>
+              <w:top w:type="dxa" w:w="100"/>
+              <w:left w:type="dxa" w:w="140"/>
+              <w:bottom w:type="dxa" w:w="100"/>
+              <w:right w:type="dxa" w:w="140"/>
+            </w:tcMar>
+          </w:tcPr>
+          <w:p>
+            <w:r>
+              <w:rPr>
+                <w:rFonts w:ascii="Arial" w:cs="Arial" w:eastAsia="Arial" w:hAnsi="Arial"/>
+                <w:b w:val="false"/>
+                <w:bCs w:val="false"/>
+                <w:color w:val="1E293B"/>
+                <w:sz w:val="19"/>
+                <w:szCs w:val="19"/>
+              </w:rPr>
+              <w:t xml:space="preserve">21/21 checks passed. No dependency or configuration issues.</w:t>
+            </w:r>
+          </w:p>
+        </w:tc>
+      </w:tr>
+    </w:tbl>
+    <w:p>
+      <w:pPr>
+        <w:spacing w:after="240"/>
+      </w:pPr>
+    </w:p>
+    <w:p>
+      <w:pPr>
+        <w:pStyle w:val="Heading1"/>
+        <w:spacing w:after="120" w:before="240"/>
+      </w:pPr>
+      <w:r>
+        <w:rPr>
+          <w:b/>
+          <w:bCs/>
+          <w:color w:val="0F172A"/>
+          <w:sz w:val="32"/>
+          <w:szCs w:val="32"/>
+        </w:rPr>
+        <w:t xml:space="preserve">5. Jest Code Coverage Metrics</w:t>
+      </w:r>
+    </w:p>
+    <w:tbl>
+      <w:tblPr>
+        <w:tblW w:type="pct" w:w="5000"/>
+        <w:tblBorders>
+          <w:top w:val="single" w:color="auto" w:sz="4"/>
+          <w:left w:val="single" w:color="auto" w:sz="4"/>
+          <w:bottom w:val="single" w:color="auto" w:sz="4"/>
+          <w:right w:val="single" w:color="auto" w:sz="4"/>
+          <w:insideH w:val="single" w:color="auto" w:sz="4"/>
+          <w:insideV w:val="single" w:color="auto" w:sz="4"/>
+        </w:tblBorders>
+      </w:tblPr>
+      <w:tblGrid>
+        <w:gridCol w:w="2708"/>
+        <w:gridCol w:w="1534"/>
+        <w:gridCol w:w="1534"/>
+        <w:gridCol w:w="1625"/>
+        <w:gridCol w:w="1625"/>
+      </w:tblGrid>
+      <w:tr>
+        <w:tc>
+          <w:tcPr>
+            <w:tcW w:type="pct" w:w="1500"/>
+            <w:shd w:fill="0F172A" w:val="clear"/>
+            <w:tcMar>
+              <w:top w:type="dxa" w:w="120"/>
+              <w:left w:type="dxa" w:w="140"/>
+              <w:bottom w:type="dxa" w:w="120"/>
+              <w:right w:type="dxa" w:w="140"/>
+            </w:tcMar>
+          </w:tcPr>
+          <w:p>
+            <w:pPr>
+              <w:jc w:val="left"/>
+            </w:pPr>
+            <w:r>
+              <w:rPr>
+                <w:rFonts w:ascii="Arial" w:cs="Arial" w:eastAsia="Arial" w:hAnsi="Arial"/>
+                <w:b/>
+                <w:bCs/>
+                <w:color w:val="FFFFFF"/>
+                <w:sz w:val="20"/>
+                <w:szCs w:val="20"/>
+              </w:rPr>
+              <w:t xml:space="preserve">Module / Directory</w:t>
+            </w:r>
+          </w:p>
+        </w:tc>
+        <w:tc>
+          <w:tcPr>
+            <w:tcW w:type="pct" w:w="850"/>
+            <w:shd w:fill="0F172A" w:val="clear"/>
+            <w:tcMar>
+              <w:top w:type="dxa" w:w="120"/>
+              <w:left w:type="dxa" w:w="140"/>
+              <w:bottom w:type="dxa" w:w="120"/>
+              <w:right w:type="dxa" w:w="140"/>
+            </w:tcMar>
+          </w:tcPr>
+          <w:p>
+            <w:pPr>
+              <w:jc w:val="left"/>
+            </w:pPr>
+            <w:r>
+              <w:rPr>
+                <w:rFonts w:ascii="Arial" w:cs="Arial" w:eastAsia="Arial" w:hAnsi="Arial"/>
+                <w:b/>
+                <w:bCs/>
+                <w:color w:val="FFFFFF"/>
+                <w:sz w:val="20"/>
+                <w:szCs w:val="20"/>
+              </w:rPr>
+              <w:t xml:space="preserve">% Statements</w:t>
+            </w:r>
+          </w:p>
+        </w:tc>
+        <w:tc>
+          <w:tcPr>
+            <w:tcW w:type="pct" w:w="850"/>
+            <w:shd w:fill="0F172A" w:val="clear"/>
+            <w:tcMar>
+              <w:top w:type="dxa" w:w="120"/>
+              <w:left w:type="dxa" w:w="140"/>
+              <w:bottom w:type="dxa" w:w="120"/>
+              <w:right w:type="dxa" w:w="140"/>
+            </w:tcMar>
+          </w:tcPr>
+          <w:p>
+            <w:pPr>
+              <w:jc w:val="left"/>
+            </w:pPr>
+            <w:r>
+              <w:rPr>
+                <w:rFonts w:ascii="Arial" w:cs="Arial" w:eastAsia="Arial" w:hAnsi="Arial"/>
+                <w:b/>
+                <w:bCs/>
+                <w:color w:val="FFFFFF"/>
+                <w:sz w:val="20"/>
+                <w:szCs w:val="20"/>
+              </w:rPr>
+              <w:t xml:space="preserve">% Branch</w:t>
+            </w:r>
+          </w:p>
+        </w:tc>
+        <w:tc>
+          <w:tcPr>
+            <w:tcW w:type="pct" w:w="900"/>
+            <w:shd w:fill="0F172A" w:val="clear"/>
+            <w:tcMar>
+              <w:top w:type="dxa" w:w="120"/>
+              <w:left w:type="dxa" w:w="140"/>
+              <w:bottom w:type="dxa" w:w="120"/>
+              <w:right w:type="dxa" w:w="140"/>
+            </w:tcMar>
+          </w:tcPr>
+          <w:p>
+            <w:pPr>
+              <w:jc w:val="left"/>
+            </w:pPr>
+            <w:r>
+              <w:rPr>
+                <w:rFonts w:ascii="Arial" w:cs="Arial" w:eastAsia="Arial" w:hAnsi="Arial"/>
+                <w:b/>
+                <w:bCs/>
+                <w:color w:val="FFFFFF"/>
+                <w:sz w:val="20"/>
+                <w:szCs w:val="20"/>
+              </w:rPr>
+              <w:t xml:space="preserve">% Functions</w:t>
+            </w:r>
+          </w:p>
+        </w:tc>
+        <w:tc>
+          <w:tcPr>
+            <w:tcW w:type="pct" w:w="900"/>
+            <w:shd w:fill="0F172A" w:val="clear"/>
+            <w:tcMar>
+              <w:top w:type="dxa" w:w="120"/>
+              <w:left w:type="dxa" w:w="140"/>
+              <w:bottom w:type="dxa" w:w="120"/>
+              <w:right w:type="dxa" w:w="140"/>
+            </w:tcMar>
+          </w:tcPr>
+          <w:p>
+            <w:pPr>
+              <w:jc w:val="left"/>
+            </w:pPr>
+            <w:r>
+              <w:rPr>
+                <w:rFonts w:ascii="Arial" w:cs="Arial" w:eastAsia="Arial" w:hAnsi="Arial"/>
+                <w:b/>
+                <w:bCs/>
+                <w:color w:val="FFFFFF"/>
+                <w:sz w:val="20"/>
+                <w:szCs w:val="20"/>
+              </w:rPr>
+              <w:t xml:space="preserve">% Lines</w:t>
+            </w:r>
+          </w:p>
+        </w:tc>
+      </w:tr>
+      <w:tr>
+        <w:tc>
+          <w:tcPr>
+            <w:tcW w:type="pct" w:w="1500"/>
+            <w:tcMar>
+              <w:top w:type="dxa" w:w="100"/>
+              <w:left w:type="dxa" w:w="140"/>
+              <w:bottom w:type="dxa" w:w="100"/>
+              <w:right w:type="dxa" w:w="140"/>
+            </w:tcMar>
+          </w:tcPr>
+          <w:p>
+            <w:r>
+              <w:rPr>
+                <w:rFonts w:ascii="Arial" w:cs="Arial" w:eastAsia="Arial" w:hAnsi="Arial"/>
+                <w:b/>
+                <w:bCs/>
+                <w:color w:val="1E293B"/>
+                <w:sz w:val="19"/>
+                <w:szCs w:val="19"/>
+              </w:rPr>
+              <w:t xml:space="preserve">src/features/ (Auth Store)</w:t>
+            </w:r>
+          </w:p>
+        </w:tc>
+        <w:tc>
+          <w:tcPr>
+            <w:tcW w:type="pct" w:w="850"/>
+            <w:tcMar>
+              <w:top w:type="dxa" w:w="100"/>
+              <w:left w:type="dxa" w:w="140"/>
+              <w:bottom w:type="dxa" w:w="100"/>
+              <w:right w:type="dxa" w:w="140"/>
+            </w:tcMar>
+          </w:tcPr>
+          <w:p>
+            <w:r>
+              <w:rPr>
+                <w:rFonts w:ascii="Arial" w:cs="Arial" w:eastAsia="Arial" w:hAnsi="Arial"/>
+                <w:b w:val="false"/>
+                <w:bCs w:val="false"/>
+                <w:color w:val="1E293B"/>
+                <w:sz w:val="19"/>
+                <w:szCs w:val="19"/>
+              </w:rPr>
+              <w:t xml:space="preserve">100%</w:t>
+            </w:r>
+          </w:p>
+        </w:tc>
+        <w:tc>
+          <w:tcPr>
+            <w:tcW w:type="pct" w:w="850"/>
+            <w:tcMar>
+              <w:top w:type="dxa" w:w="100"/>
+              <w:left w:type="dxa" w:w="140"/>
+              <w:bottom w:type="dxa" w:w="100"/>
+              <w:right w:type="dxa" w:w="140"/>
+            </w:tcMar>
+          </w:tcPr>
+          <w:p>
+            <w:r>
+              <w:rPr>
+                <w:rFonts w:ascii="Arial" w:cs="Arial" w:eastAsia="Arial" w:hAnsi="Arial"/>
+                <w:b w:val="false"/>
+                <w:bCs w:val="false"/>
+                <w:color w:val="1E293B"/>
+                <w:sz w:val="19"/>
+                <w:szCs w:val="19"/>
+              </w:rPr>
+              <w:t xml:space="preserve">100%</w:t>
+            </w:r>
+          </w:p>
+        </w:tc>
+        <w:tc>
+          <w:tcPr>
+            <w:tcW w:type="pct" w:w="900"/>
+            <w:tcMar>
+              <w:top w:type="dxa" w:w="100"/>
+              <w:left w:type="dxa" w:w="140"/>
+              <w:bottom w:type="dxa" w:w="100"/>
+              <w:right w:type="dxa" w:w="140"/>
+            </w:tcMar>
+          </w:tcPr>
+          <w:p>
+            <w:r>
+              <w:rPr>
+                <w:rFonts w:ascii="Arial" w:cs="Arial" w:eastAsia="Arial" w:hAnsi="Arial"/>
+                <w:b w:val="false"/>
+                <w:bCs w:val="false"/>
+                <w:color w:val="1E293B"/>
+                <w:sz w:val="19"/>
+                <w:szCs w:val="19"/>
+              </w:rPr>
+              <w:t xml:space="preserve">100%</w:t>
+            </w:r>
+          </w:p>
+        </w:tc>
+        <w:tc>
+          <w:tcPr>
+            <w:tcW w:type="pct" w:w="900"/>
+            <w:tcMar>
+              <w:top w:type="dxa" w:w="100"/>
+              <w:left w:type="dxa" w:w="140"/>
+              <w:bottom w:type="dxa" w:w="100"/>
+              <w:right w:type="dxa" w:w="140"/>
+            </w:tcMar>
+          </w:tcPr>
+          <w:p>
+            <w:r>
+              <w:rPr>
+                <w:rFonts w:ascii="Arial" w:cs="Arial" w:eastAsia="Arial" w:hAnsi="Arial"/>
+                <w:b w:val="false"/>
+                <w:bCs w:val="false"/>
+                <w:color w:val="1E293B"/>
+                <w:sz w:val="19"/>
+                <w:szCs w:val="19"/>
+              </w:rPr>
+              <w:t xml:space="preserve">100%</w:t>
+            </w:r>
+          </w:p>
+        </w:tc>
+      </w:tr>
+      <w:tr>
         <w:tc>
           <w:tcPr>
             <w:tcW w:type="pct" w:w="1500"/>
@@ -1605,13 +2048,113 @@
             <w:r>
               <w:rPr>
                 <w:rFonts w:ascii="Arial" w:cs="Arial" w:eastAsia="Arial" w:hAnsi="Arial"/>
-                <w:b w:val="false"/>
-                <w:bCs w:val="false"/>
-                <w:color w:val="1E293B"/>
-                <w:sz w:val="19"/>
-                <w:szCs w:val="19"/>
-              </w:rPr>
-              <w:t xml:space="preserve">Boots clean, exports env, no warnings or deprecations.</w:t>
+                <w:b/>
+                <w:bCs/>
+                <w:color w:val="1E293B"/>
+                <w:sz w:val="19"/>
+                <w:szCs w:val="19"/>
+              </w:rPr>
+              <w:t xml:space="preserve">src/shared/hooks/ (Theme)</w:t>
+            </w:r>
+          </w:p>
+        </w:tc>
+        <w:tc>
+          <w:tcPr>
+            <w:tcW w:type="pct" w:w="850"/>
+            <w:shd w:fill="F8FAFC" w:val="clear"/>
+            <w:tcMar>
+              <w:top w:type="dxa" w:w="100"/>
+              <w:left w:type="dxa" w:w="140"/>
+              <w:bottom w:type="dxa" w:w="100"/>
+              <w:right w:type="dxa" w:w="140"/>
+            </w:tcMar>
+          </w:tcPr>
+          <w:p>
+            <w:r>
+              <w:rPr>
+                <w:rFonts w:ascii="Arial" w:cs="Arial" w:eastAsia="Arial" w:hAnsi="Arial"/>
+                <w:b w:val="false"/>
+                <w:bCs w:val="false"/>
+                <w:color w:val="1E293B"/>
+                <w:sz w:val="19"/>
+                <w:szCs w:val="19"/>
+              </w:rPr>
+              <w:t xml:space="preserve">100%</w:t>
+            </w:r>
+          </w:p>
+        </w:tc>
+        <w:tc>
+          <w:tcPr>
+            <w:tcW w:type="pct" w:w="850"/>
+            <w:shd w:fill="F8FAFC" w:val="clear"/>
+            <w:tcMar>
+              <w:top w:type="dxa" w:w="100"/>
+              <w:left w:type="dxa" w:w="140"/>
+              <w:bottom w:type="dxa" w:w="100"/>
+              <w:right w:type="dxa" w:w="140"/>
+            </w:tcMar>
+          </w:tcPr>
+          <w:p>
+            <w:r>
+              <w:rPr>
+                <w:rFonts w:ascii="Arial" w:cs="Arial" w:eastAsia="Arial" w:hAnsi="Arial"/>
+                <w:b w:val="false"/>
+                <w:bCs w:val="false"/>
+                <w:color w:val="1E293B"/>
+                <w:sz w:val="19"/>
+                <w:szCs w:val="19"/>
+              </w:rPr>
+              <w:t xml:space="preserve">100%</w:t>
+            </w:r>
+          </w:p>
+        </w:tc>
+        <w:tc>
+          <w:tcPr>
+            <w:tcW w:type="pct" w:w="900"/>
+            <w:shd w:fill="F8FAFC" w:val="clear"/>
+            <w:tcMar>
+              <w:top w:type="dxa" w:w="100"/>
+              <w:left w:type="dxa" w:w="140"/>
+              <w:bottom w:type="dxa" w:w="100"/>
+              <w:right w:type="dxa" w:w="140"/>
+            </w:tcMar>
+          </w:tcPr>
+          <w:p>
+            <w:r>
+              <w:rPr>
+                <w:rFonts w:ascii="Arial" w:cs="Arial" w:eastAsia="Arial" w:hAnsi="Arial"/>
+                <w:b w:val="false"/>
+                <w:bCs w:val="false"/>
+                <w:color w:val="1E293B"/>
+                <w:sz w:val="19"/>
+                <w:szCs w:val="19"/>
+              </w:rPr>
+              <w:t xml:space="preserve">100%</w:t>
+            </w:r>
+          </w:p>
+        </w:tc>
+        <w:tc>
+          <w:tcPr>
+            <w:tcW w:type="pct" w:w="900"/>
+            <w:shd w:fill="F8FAFC" w:val="clear"/>
+            <w:tcMar>
+              <w:top w:type="dxa" w:w="100"/>
+              <w:left w:type="dxa" w:w="140"/>
+              <w:bottom w:type="dxa" w:w="100"/>
+              <w:right w:type="dxa" w:w="140"/>
+            </w:tcMar>
+          </w:tcPr>
+          <w:p>
+            <w:r>
+              <w:rPr>
+                <w:rFonts w:ascii="Arial" w:cs="Arial" w:eastAsia="Arial" w:hAnsi="Arial"/>
+                <w:b w:val="false"/>
+                <w:bCs w:val="false"/>
+                <w:color w:val="1E293B"/>
+                <w:sz w:val="19"/>
+                <w:szCs w:val="19"/>
+              </w:rPr>
+              <w:t xml:space="preserve">100%</w:t>
             </w:r>
           </w:p>
         </w:tc>
@@ -1619,78 +2162,6 @@
       <w:tr>
         <w:tc>
           <w:tcPr>
-            <w:tcW w:type="pct" w:w="1400"/>
-            <w:tcMar>
-              <w:top w:type="dxa" w:w="100"/>
-              <w:left w:type="dxa" w:w="140"/>
-              <w:bottom w:type="dxa" w:w="100"/>
-              <w:right w:type="dxa" w:w="140"/>
-            </w:tcMar>
-          </w:tcPr>
-          <w:p>
-            <w:r>
-              <w:rPr>
-                <w:rFonts w:ascii="Arial" w:cs="Arial" w:eastAsia="Arial" w:hAnsi="Arial"/>
-                <w:b/>
-                <w:bCs/>
-                <w:color w:val="1E293B"/>
-                <w:sz w:val="19"/>
-                <w:szCs w:val="19"/>
-              </w:rPr>
-              <w:t xml:space="preserve">Cross-Platform Bundle</w:t>
-            </w:r>
-          </w:p>
-        </w:tc>
-        <w:tc>
-          <w:tcPr>
-            <w:tcW w:type="pct" w:w="1400"/>
-            <w:tcMar>
-              <w:top w:type="dxa" w:w="100"/>
-              <w:left w:type="dxa" w:w="140"/>
-              <w:bottom w:type="dxa" w:w="100"/>
-              <w:right w:type="dxa" w:w="140"/>
-            </w:tcMar>
-          </w:tcPr>
-          <w:p>
-            <w:r>
-              <w:rPr>
-                <w:rFonts w:ascii="Arial" w:cs="Arial" w:eastAsia="Arial" w:hAnsi="Arial"/>
-                <w:b w:val="false"/>
-                <w:bCs w:val="false"/>
-                <w:color w:val="1E293B"/>
-                <w:sz w:val="19"/>
-                <w:szCs w:val="19"/>
-              </w:rPr>
-              <w:t xml:space="preserve">npx expo export</w:t>
-            </w:r>
-          </w:p>
-        </w:tc>
-        <w:tc>
-          <w:tcPr>
-            <w:tcW w:type="pct" w:w="700"/>
-            <w:tcMar>
-              <w:top w:type="dxa" w:w="100"/>
-              <w:left w:type="dxa" w:w="140"/>
-              <w:bottom w:type="dxa" w:w="100"/>
-              <w:right w:type="dxa" w:w="140"/>
-            </w:tcMar>
-          </w:tcPr>
-          <w:p>
-            <w:r>
-              <w:rPr>
-                <w:rFonts w:ascii="Arial" w:cs="Arial" w:eastAsia="Arial" w:hAnsi="Arial"/>
-                <w:b/>
-                <w:bCs/>
-                <w:color w:val="1E293B"/>
-                <w:sz w:val="19"/>
-                <w:szCs w:val="19"/>
-              </w:rPr>
-              <w:t xml:space="preserve">PASSED</w:t>
-            </w:r>
-          </w:p>
-        </w:tc>
-        <w:tc>
-          <w:tcPr>
             <w:tcW w:type="pct" w:w="1500"/>
             <w:tcMar>
               <w:top w:type="dxa" w:w="100"/>
@@ -1703,13 +2174,109 @@
             <w:r>
               <w:rPr>
                 <w:rFonts w:ascii="Arial" w:cs="Arial" w:eastAsia="Arial" w:hAnsi="Arial"/>
-                <w:b w:val="false"/>
-                <w:bCs w:val="false"/>
-                <w:color w:val="1E293B"/>
-                <w:sz w:val="19"/>
-                <w:szCs w:val="19"/>
-              </w:rPr>
-              <w:t xml:space="preserve">Bundled 100% of screens for iOS, Android, and Web.</w:t>
+                <w:b/>
+                <w:bCs/>
+                <w:color w:val="1E293B"/>
+                <w:sz w:val="19"/>
+                <w:szCs w:val="19"/>
+              </w:rPr>
+              <w:t xml:space="preserve">src/shared/lib/ (Logger, Sentry, Supabase)</w:t>
+            </w:r>
+          </w:p>
+        </w:tc>
+        <w:tc>
+          <w:tcPr>
+            <w:tcW w:type="pct" w:w="850"/>
+            <w:tcMar>
+              <w:top w:type="dxa" w:w="100"/>
+              <w:left w:type="dxa" w:w="140"/>
+              <w:bottom w:type="dxa" w:w="100"/>
+              <w:right w:type="dxa" w:w="140"/>
+            </w:tcMar>
+          </w:tcPr>
+          <w:p>
+            <w:r>
+              <w:rPr>
+                <w:rFonts w:ascii="Arial" w:cs="Arial" w:eastAsia="Arial" w:hAnsi="Arial"/>
+                <w:b w:val="false"/>
+                <w:bCs w:val="false"/>
+                <w:color w:val="1E293B"/>
+                <w:sz w:val="19"/>
+                <w:szCs w:val="19"/>
+              </w:rPr>
+              <w:t xml:space="preserve">95.52%</w:t>
+            </w:r>
+          </w:p>
+        </w:tc>
+        <w:tc>
+          <w:tcPr>
+            <w:tcW w:type="pct" w:w="850"/>
+            <w:tcMar>
+              <w:top w:type="dxa" w:w="100"/>
+              <w:left w:type="dxa" w:w="140"/>
+              <w:bottom w:type="dxa" w:w="100"/>
+              <w:right w:type="dxa" w:w="140"/>
+            </w:tcMar>
+          </w:tcPr>
+          <w:p>
+            <w:r>
+              <w:rPr>
+                <w:rFonts w:ascii="Arial" w:cs="Arial" w:eastAsia="Arial" w:hAnsi="Arial"/>
+                <w:b w:val="false"/>
+                <w:bCs w:val="false"/>
+                <w:color w:val="1E293B"/>
+                <w:sz w:val="19"/>
+                <w:szCs w:val="19"/>
+              </w:rPr>
+              <w:t xml:space="preserve">83.33%</w:t>
+            </w:r>
+          </w:p>
+        </w:tc>
+        <w:tc>
+          <w:tcPr>
+            <w:tcW w:type="pct" w:w="900"/>
+            <w:tcMar>
+              <w:top w:type="dxa" w:w="100"/>
+              <w:left w:type="dxa" w:w="140"/>
+              <w:bottom w:type="dxa" w:w="100"/>
+              <w:right w:type="dxa" w:w="140"/>
+            </w:tcMar>
+          </w:tcPr>
+          <w:p>
+            <w:r>
+              <w:rPr>
+                <w:rFonts w:ascii="Arial" w:cs="Arial" w:eastAsia="Arial" w:hAnsi="Arial"/>
+                <w:b w:val="false"/>
+                <w:bCs w:val="false"/>
+                <w:color w:val="1E293B"/>
+                <w:sz w:val="19"/>
+                <w:szCs w:val="19"/>
+              </w:rPr>
+              <w:t xml:space="preserve">70.83%</w:t>
+            </w:r>
+          </w:p>
+        </w:tc>
+        <w:tc>
+          <w:tcPr>
+            <w:tcW w:type="pct" w:w="900"/>
+            <w:tcMar>
+              <w:top w:type="dxa" w:w="100"/>
+              <w:left w:type="dxa" w:w="140"/>
+              <w:bottom w:type="dxa" w:w="100"/>
+              <w:right w:type="dxa" w:w="140"/>
+            </w:tcMar>
+          </w:tcPr>
+          <w:p>
+            <w:r>
+              <w:rPr>
+                <w:rFonts w:ascii="Arial" w:cs="Arial" w:eastAsia="Arial" w:hAnsi="Arial"/>
+                <w:b w:val="false"/>
+                <w:bCs w:val="false"/>
+                <w:color w:val="1E293B"/>
+                <w:sz w:val="19"/>
+                <w:szCs w:val="19"/>
+              </w:rPr>
+              <w:t xml:space="preserve">96.00%</w:t>
             </w:r>
           </w:p>
         </w:tc>
@@ -1717,81 +2284,6 @@
       <w:tr>
         <w:tc>
           <w:tcPr>
-            <w:tcW w:type="pct" w:w="1400"/>
-            <w:shd w:fill="F8FAFC" w:val="clear"/>
-            <w:tcMar>
-              <w:top w:type="dxa" w:w="100"/>
-              <w:left w:type="dxa" w:w="140"/>
-              <w:bottom w:type="dxa" w:w="100"/>
-              <w:right w:type="dxa" w:w="140"/>
-            </w:tcMar>
-          </w:tcPr>
-          <w:p>
-            <w:r>
-              <w:rPr>
-                <w:rFonts w:ascii="Arial" w:cs="Arial" w:eastAsia="Arial" w:hAnsi="Arial"/>
-                <w:b/>
-                <w:bCs/>
-                <w:color w:val="1E293B"/>
-                <w:sz w:val="19"/>
-                <w:szCs w:val="19"/>
-              </w:rPr>
-              <w:t xml:space="preserve">Git Repository State</w:t>
-            </w:r>
-          </w:p>
-        </w:tc>
-        <w:tc>
-          <w:tcPr>
-            <w:tcW w:type="pct" w:w="1400"/>
-            <w:shd w:fill="F8FAFC" w:val="clear"/>
-            <w:tcMar>
-              <w:top w:type="dxa" w:w="100"/>
-              <w:left w:type="dxa" w:w="140"/>
-              <w:bottom w:type="dxa" w:w="100"/>
-              <w:right w:type="dxa" w:w="140"/>
-            </w:tcMar>
-          </w:tcPr>
-          <w:p>
-            <w:r>
-              <w:rPr>
-                <w:rFonts w:ascii="Arial" w:cs="Arial" w:eastAsia="Arial" w:hAnsi="Arial"/>
-                <w:b w:val="false"/>
-                <w:bCs w:val="false"/>
-                <w:color w:val="1E293B"/>
-                <w:sz w:val="19"/>
-                <w:szCs w:val="19"/>
-              </w:rPr>
-              <w:t xml:space="preserve">git status / log</w:t>
-            </w:r>
-          </w:p>
-        </w:tc>
-        <w:tc>
-          <w:tcPr>
-            <w:tcW w:type="pct" w:w="700"/>
-            <w:shd w:fill="F8FAFC" w:val="clear"/>
-            <w:tcMar>
-              <w:top w:type="dxa" w:w="100"/>
-              <w:left w:type="dxa" w:w="140"/>
-              <w:bottom w:type="dxa" w:w="100"/>
-              <w:right w:type="dxa" w:w="140"/>
-            </w:tcMar>
-          </w:tcPr>
-          <w:p>
-            <w:r>
-              <w:rPr>
-                <w:rFonts w:ascii="Arial" w:cs="Arial" w:eastAsia="Arial" w:hAnsi="Arial"/>
-                <w:b/>
-                <w:bCs/>
-                <w:color w:val="1E293B"/>
-                <w:sz w:val="19"/>
-                <w:szCs w:val="19"/>
-              </w:rPr>
-              <w:t xml:space="preserve">PASSED</w:t>
-            </w:r>
-          </w:p>
-        </w:tc>
-        <w:tc>
-          <w:tcPr>
             <w:tcW w:type="pct" w:w="1500"/>
             <w:shd w:fill="F8FAFC" w:val="clear"/>
             <w:tcMar>
@@ -1805,13 +2297,362 @@
             <w:r>
               <w:rPr>
                 <w:rFonts w:ascii="Arial" w:cs="Arial" w:eastAsia="Arial" w:hAnsi="Arial"/>
-                <w:b w:val="false"/>
-                <w:bCs w:val="false"/>
-                <w:color w:val="1E293B"/>
-                <w:sz w:val="19"/>
-                <w:szCs w:val="19"/>
-              </w:rPr>
-              <w:t xml:space="preserve">Clean tree. .env securely ignored; .env.example tracked.</w:t>
+                <w:b/>
+                <w:bCs/>
+                <w:color w:val="1E293B"/>
+                <w:sz w:val="19"/>
+                <w:szCs w:val="19"/>
+              </w:rPr>
+              <w:t xml:space="preserve">src/shared/ui/ (5 States, Skeletons, Errors)</w:t>
+            </w:r>
+          </w:p>
+        </w:tc>
+        <w:tc>
+          <w:tcPr>
+            <w:tcW w:type="pct" w:w="850"/>
+            <w:shd w:fill="F8FAFC" w:val="clear"/>
+            <w:tcMar>
+              <w:top w:type="dxa" w:w="100"/>
+              <w:left w:type="dxa" w:w="140"/>
+              <w:bottom w:type="dxa" w:w="100"/>
+              <w:right w:type="dxa" w:w="140"/>
+            </w:tcMar>
+          </w:tcPr>
+          <w:p>
+            <w:r>
+              <w:rPr>
+                <w:rFonts w:ascii="Arial" w:cs="Arial" w:eastAsia="Arial" w:hAnsi="Arial"/>
+                <w:b w:val="false"/>
+                <w:bCs w:val="false"/>
+                <w:color w:val="1E293B"/>
+                <w:sz w:val="19"/>
+                <w:szCs w:val="19"/>
+              </w:rPr>
+              <w:t xml:space="preserve">100%</w:t>
+            </w:r>
+          </w:p>
+        </w:tc>
+        <w:tc>
+          <w:tcPr>
+            <w:tcW w:type="pct" w:w="850"/>
+            <w:shd w:fill="F8FAFC" w:val="clear"/>
+            <w:tcMar>
+              <w:top w:type="dxa" w:w="100"/>
+              <w:left w:type="dxa" w:w="140"/>
+              <w:bottom w:type="dxa" w:w="100"/>
+              <w:right w:type="dxa" w:w="140"/>
+            </w:tcMar>
+          </w:tcPr>
+          <w:p>
+            <w:r>
+              <w:rPr>
+                <w:rFonts w:ascii="Arial" w:cs="Arial" w:eastAsia="Arial" w:hAnsi="Arial"/>
+                <w:b w:val="false"/>
+                <w:bCs w:val="false"/>
+                <w:color w:val="1E293B"/>
+                <w:sz w:val="19"/>
+                <w:szCs w:val="19"/>
+              </w:rPr>
+              <w:t xml:space="preserve">72.72%</w:t>
+            </w:r>
+          </w:p>
+        </w:tc>
+        <w:tc>
+          <w:tcPr>
+            <w:tcW w:type="pct" w:w="900"/>
+            <w:shd w:fill="F8FAFC" w:val="clear"/>
+            <w:tcMar>
+              <w:top w:type="dxa" w:w="100"/>
+              <w:left w:type="dxa" w:w="140"/>
+              <w:bottom w:type="dxa" w:w="100"/>
+              <w:right w:type="dxa" w:w="140"/>
+            </w:tcMar>
+          </w:tcPr>
+          <w:p>
+            <w:r>
+              <w:rPr>
+                <w:rFonts w:ascii="Arial" w:cs="Arial" w:eastAsia="Arial" w:hAnsi="Arial"/>
+                <w:b w:val="false"/>
+                <w:bCs w:val="false"/>
+                <w:color w:val="1E293B"/>
+                <w:sz w:val="19"/>
+                <w:szCs w:val="19"/>
+              </w:rPr>
+              <w:t xml:space="preserve">100%</w:t>
+            </w:r>
+          </w:p>
+        </w:tc>
+        <w:tc>
+          <w:tcPr>
+            <w:tcW w:type="pct" w:w="900"/>
+            <w:shd w:fill="F8FAFC" w:val="clear"/>
+            <w:tcMar>
+              <w:top w:type="dxa" w:w="100"/>
+              <w:left w:type="dxa" w:w="140"/>
+              <w:bottom w:type="dxa" w:w="100"/>
+              <w:right w:type="dxa" w:w="140"/>
+            </w:tcMar>
+          </w:tcPr>
+          <w:p>
+            <w:r>
+              <w:rPr>
+                <w:rFonts w:ascii="Arial" w:cs="Arial" w:eastAsia="Arial" w:hAnsi="Arial"/>
+                <w:b w:val="false"/>
+                <w:bCs w:val="false"/>
+                <w:color w:val="1E293B"/>
+                <w:sz w:val="19"/>
+                <w:szCs w:val="19"/>
+              </w:rPr>
+              <w:t xml:space="preserve">100%</w:t>
+            </w:r>
+          </w:p>
+        </w:tc>
+      </w:tr>
+      <w:tr>
+        <w:tc>
+          <w:tcPr>
+            <w:tcW w:type="pct" w:w="1500"/>
+            <w:tcMar>
+              <w:top w:type="dxa" w:w="100"/>
+              <w:left w:type="dxa" w:w="140"/>
+              <w:bottom w:type="dxa" w:w="100"/>
+              <w:right w:type="dxa" w:w="140"/>
+            </w:tcMar>
+          </w:tcPr>
+          <w:p>
+            <w:r>
+              <w:rPr>
+                <w:rFonts w:ascii="Arial" w:cs="Arial" w:eastAsia="Arial" w:hAnsi="Arial"/>
+                <w:b/>
+                <w:bCs/>
+                <w:color w:val="1E293B"/>
+                <w:sz w:val="19"/>
+                <w:szCs w:val="19"/>
+              </w:rPr>
+              <w:t xml:space="preserve">src/shared/utils/ (Asia/Kolkata Date)</w:t>
+            </w:r>
+          </w:p>
+        </w:tc>
+        <w:tc>
+          <w:tcPr>
+            <w:tcW w:type="pct" w:w="850"/>
+            <w:tcMar>
+              <w:top w:type="dxa" w:w="100"/>
+              <w:left w:type="dxa" w:w="140"/>
+              <w:bottom w:type="dxa" w:w="100"/>
+              <w:right w:type="dxa" w:w="140"/>
+            </w:tcMar>
+          </w:tcPr>
+          <w:p>
+            <w:r>
+              <w:rPr>
+                <w:rFonts w:ascii="Arial" w:cs="Arial" w:eastAsia="Arial" w:hAnsi="Arial"/>
+                <w:b w:val="false"/>
+                <w:bCs w:val="false"/>
+                <w:color w:val="1E293B"/>
+                <w:sz w:val="19"/>
+                <w:szCs w:val="19"/>
+              </w:rPr>
+              <w:t xml:space="preserve">100%</w:t>
+            </w:r>
+          </w:p>
+        </w:tc>
+        <w:tc>
+          <w:tcPr>
+            <w:tcW w:type="pct" w:w="850"/>
+            <w:tcMar>
+              <w:top w:type="dxa" w:w="100"/>
+              <w:left w:type="dxa" w:w="140"/>
+              <w:bottom w:type="dxa" w:w="100"/>
+              <w:right w:type="dxa" w:w="140"/>
+            </w:tcMar>
+          </w:tcPr>
+          <w:p>
+            <w:r>
+              <w:rPr>
+                <w:rFonts w:ascii="Arial" w:cs="Arial" w:eastAsia="Arial" w:hAnsi="Arial"/>
+                <w:b w:val="false"/>
+                <w:bCs w:val="false"/>
+                <w:color w:val="1E293B"/>
+                <w:sz w:val="19"/>
+                <w:szCs w:val="19"/>
+              </w:rPr>
+              <w:t xml:space="preserve">95.83%</w:t>
+            </w:r>
+          </w:p>
+        </w:tc>
+        <w:tc>
+          <w:tcPr>
+            <w:tcW w:type="pct" w:w="900"/>
+            <w:tcMar>
+              <w:top w:type="dxa" w:w="100"/>
+              <w:left w:type="dxa" w:w="140"/>
+              <w:bottom w:type="dxa" w:w="100"/>
+              <w:right w:type="dxa" w:w="140"/>
+            </w:tcMar>
+          </w:tcPr>
+          <w:p>
+            <w:r>
+              <w:rPr>
+                <w:rFonts w:ascii="Arial" w:cs="Arial" w:eastAsia="Arial" w:hAnsi="Arial"/>
+                <w:b w:val="false"/>
+                <w:bCs w:val="false"/>
+                <w:color w:val="1E293B"/>
+                <w:sz w:val="19"/>
+                <w:szCs w:val="19"/>
+              </w:rPr>
+              <w:t xml:space="preserve">100%</w:t>
+            </w:r>
+          </w:p>
+        </w:tc>
+        <w:tc>
+          <w:tcPr>
+            <w:tcW w:type="pct" w:w="900"/>
+            <w:tcMar>
+              <w:top w:type="dxa" w:w="100"/>
+              <w:left w:type="dxa" w:w="140"/>
+              <w:bottom w:type="dxa" w:w="100"/>
+              <w:right w:type="dxa" w:w="140"/>
+            </w:tcMar>
+          </w:tcPr>
+          <w:p>
+            <w:r>
+              <w:rPr>
+                <w:rFonts w:ascii="Arial" w:cs="Arial" w:eastAsia="Arial" w:hAnsi="Arial"/>
+                <w:b w:val="false"/>
+                <w:bCs w:val="false"/>
+                <w:color w:val="1E293B"/>
+                <w:sz w:val="19"/>
+                <w:szCs w:val="19"/>
+              </w:rPr>
+              <w:t xml:space="preserve">100%</w:t>
+            </w:r>
+          </w:p>
+        </w:tc>
+      </w:tr>
+      <w:tr>
+        <w:tc>
+          <w:tcPr>
+            <w:tcW w:type="pct" w:w="1500"/>
+            <w:shd w:fill="F8FAFC" w:val="clear"/>
+            <w:tcMar>
+              <w:top w:type="dxa" w:w="100"/>
+              <w:left w:type="dxa" w:w="140"/>
+              <w:bottom w:type="dxa" w:w="100"/>
+              <w:right w:type="dxa" w:w="140"/>
+            </w:tcMar>
+          </w:tcPr>
+          <w:p>
+            <w:r>
+              <w:rPr>
+                <w:rFonts w:ascii="Arial" w:cs="Arial" w:eastAsia="Arial" w:hAnsi="Arial"/>
+                <w:b/>
+                <w:bCs/>
+                <w:color w:val="1E293B"/>
+                <w:sz w:val="19"/>
+                <w:szCs w:val="19"/>
+              </w:rPr>
+              <w:t xml:space="preserve">All Monitored Codebase Files</w:t>
+            </w:r>
+          </w:p>
+        </w:tc>
+        <w:tc>
+          <w:tcPr>
+            <w:tcW w:type="pct" w:w="850"/>
+            <w:shd w:fill="F8FAFC" w:val="clear"/>
+            <w:tcMar>
+              <w:top w:type="dxa" w:w="100"/>
+              <w:left w:type="dxa" w:w="140"/>
+              <w:bottom w:type="dxa" w:w="100"/>
+              <w:right w:type="dxa" w:w="140"/>
+            </w:tcMar>
+          </w:tcPr>
+          <w:p>
+            <w:r>
+              <w:rPr>
+                <w:rFonts w:ascii="Arial" w:cs="Arial" w:eastAsia="Arial" w:hAnsi="Arial"/>
+                <w:b/>
+                <w:bCs/>
+                <w:color w:val="1E293B"/>
+                <w:sz w:val="19"/>
+                <w:szCs w:val="19"/>
+              </w:rPr>
+              <w:t xml:space="preserve">97.27%</w:t>
+            </w:r>
+          </w:p>
+        </w:tc>
+        <w:tc>
+          <w:tcPr>
+            <w:tcW w:type="pct" w:w="850"/>
+            <w:shd w:fill="F8FAFC" w:val="clear"/>
+            <w:tcMar>
+              <w:top w:type="dxa" w:w="100"/>
+              <w:left w:type="dxa" w:w="140"/>
+              <w:bottom w:type="dxa" w:w="100"/>
+              <w:right w:type="dxa" w:w="140"/>
+            </w:tcMar>
+          </w:tcPr>
+          <w:p>
+            <w:r>
+              <w:rPr>
+                <w:rFonts w:ascii="Arial" w:cs="Arial" w:eastAsia="Arial" w:hAnsi="Arial"/>
+                <w:b/>
+                <w:bCs/>
+                <w:color w:val="1E293B"/>
+                <w:sz w:val="19"/>
+                <w:szCs w:val="19"/>
+              </w:rPr>
+              <w:t xml:space="preserve">83.67%</w:t>
+            </w:r>
+          </w:p>
+        </w:tc>
+        <w:tc>
+          <w:tcPr>
+            <w:tcW w:type="pct" w:w="900"/>
+            <w:shd w:fill="F8FAFC" w:val="clear"/>
+            <w:tcMar>
+              <w:top w:type="dxa" w:w="100"/>
+              <w:left w:type="dxa" w:w="140"/>
+              <w:bottom w:type="dxa" w:w="100"/>
+              <w:right w:type="dxa" w:w="140"/>
+            </w:tcMar>
+          </w:tcPr>
+          <w:p>
+            <w:r>
+              <w:rPr>
+                <w:rFonts w:ascii="Arial" w:cs="Arial" w:eastAsia="Arial" w:hAnsi="Arial"/>
+                <w:b/>
+                <w:bCs/>
+                <w:color w:val="1E293B"/>
+                <w:sz w:val="19"/>
+                <w:szCs w:val="19"/>
+              </w:rPr>
+              <w:t xml:space="preserve">85.10%</w:t>
+            </w:r>
+          </w:p>
+        </w:tc>
+        <w:tc>
+          <w:tcPr>
+            <w:tcW w:type="pct" w:w="900"/>
+            <w:shd w:fill="F8FAFC" w:val="clear"/>
+            <w:tcMar>
+              <w:top w:type="dxa" w:w="100"/>
+              <w:left w:type="dxa" w:w="140"/>
+              <w:bottom w:type="dxa" w:w="100"/>
+              <w:right w:type="dxa" w:w="140"/>
+            </w:tcMar>
+          </w:tcPr>
+          <w:p>
+            <w:r>
+              <w:rPr>
+                <w:rFonts w:ascii="Arial" w:cs="Arial" w:eastAsia="Arial" w:hAnsi="Arial"/>
+                <w:b/>
+                <w:bCs/>
+                <w:color w:val="1E293B"/>
+                <w:sz w:val="19"/>
+                <w:szCs w:val="19"/>
+              </w:rPr>
+              <w:t xml:space="preserve">97.60%</w:t>
             </w:r>
           </w:p>
         </w:tc>
@@ -1847,10 +2688,10 @@
           <w:b/>
           <w:bCs/>
         </w:rPr>
-        <w:t xml:space="preserve">• Phase 2 — Data Integration: </w:t>
+        <w:t xml:space="preserve">• Phase 3 — Supabase Data Integration: </w:t>
       </w:r>
       <w:r>
-        <w:t xml:space="preserve">Connect live Supabase Postgres schemas for teams, schedules, problem statements, and real-time score feeds using TanStack Query hooks.
+        <w:t xml:space="preserve">Build domain API services for schedules, problem statements, teams, and evaluations in src/features/&lt;feature&gt;/api/, exposed via TanStack Query custom hooks and strictly validated through Zod schemas.
 </w:t>
       </w:r>
       <w:r>
@@ -1858,10 +2699,10 @@
           <w:b/>
           <w:bCs/>
         </w:rPr>
-        <w:t xml:space="preserve">• Phase 3 — Real-Time Push &amp; WebSockets: </w:t>
+        <w:t xml:space="preserve">• Phase 4 — Real-Time WebSocket Feeds: </w:t>
       </w:r>
       <w:r>
-        <w:t xml:space="preserve">Deploy Supabase Realtime subscriptions to dynamically re-order the Leaderboard and broadcast emergency announcements to participants.
+        <w:t xml:space="preserve">Subscribe to Supabase Realtime channels for instant score calculation, leaderboard updates, and emergency hackathon announcements.
 </w:t>
       </w:r>
       <w:r>
@@ -1869,10 +2710,10 @@
           <w:b/>
           <w:bCs/>
         </w:rPr>
-        <w:t xml:space="preserve">• Phase 4 — Offline-First Caching &amp; Maps: </w:t>
+        <w:t xml:space="preserve">• Phase 5 — Offline Caching &amp; Interactive Campus Maps: </w:t>
       </w:r>
       <w:r>
-        <w:t xml:space="preserve">Leverage NetInfo, AsyncStorage, and react-native-maps to provide offline venue navigation and cached schedule inspection when event Wi-Fi is congested.
+        <w:t xml:space="preserve">Integrate react-native-maps with indoor campus coordinates, caching schedule data locally via NetInfo + AsyncStorage for resilient offline access.
 </w:t>
       </w:r>
       <w:r>
@@ -1880,10 +2721,10 @@
           <w:b/>
           <w:bCs/>
         </w:rPr>
-        <w:t xml:space="preserve">• Phase 5 — Production Builds &amp; EAS: </w:t>
+        <w:t xml:space="preserve">• Phase 6 — Production Cloud Builds &amp; EAS: </w:t>
       </w:r>
       <w:r>
-        <w:t xml:space="preserve">Configure EAS Build profiles for iOS TestFlight and Android Google Play Internal App Sharing distribution.</w:t>
+        <w:t xml:space="preserve">Execute automated EAS builds with release profiles for Google Play Internal App Sharing and iOS TestFlight.</w:t>
       </w:r>
     </w:p>
     <w:sectPr>
@@ -2075,7 +2916,7 @@
         <w:sz w:val="16"/>
         <w:szCs w:val="16"/>
       </w:rPr>
-      <w:t xml:space="preserve">Prayatna Companion — Engineering Project Report</w:t>
+      <w:t xml:space="preserve">Prayatna Companion — Engineering Architecture &amp; Progress Report</w:t>
     </w:r>
   </w:p>
 </w:hdr>

</xml_diff>

<commit_message>
feat(db): add initial Supabase migration with RLS, triggers, views, and realtime
</commit_message>
<xml_diff>
--- a/docs/Prayatna_Companion_Progress_Report.docx
+++ b/docs/Prayatna_Companion_Progress_Report.docx
@@ -1075,10 +1075,34 @@
     </w:p>
     <w:p>
       <w:pPr>
-        <w:spacing w:after="200"/>
+        <w:spacing w:after="140"/>
       </w:pPr>
       <w:r>
         <w:t xml:space="preserve">Every screen in the application utilizes &lt;ScreenState&gt; to handle five distinct UX states: Loading (skeleton matching layout), Success (clean render with zero layout shift), Empty (contextual glyph and message), Error (friendly explanation + Retry button), and Offline (alert banner + cached data).</w:t>
+      </w:r>
+    </w:p>
+    <w:p>
+      <w:pPr>
+        <w:pStyle w:val="Heading2"/>
+        <w:spacing w:after="80" w:before="140"/>
+      </w:pPr>
+      <w:r>
+        <w:rPr>
+          <w:b/>
+          <w:bCs/>
+          <w:color w:val="0F172A"/>
+          <w:sz w:val="26"/>
+          <w:szCs w:val="26"/>
+        </w:rPr>
+        <w:t xml:space="preserve">3.5 Supabase Database Schema &amp; Security Architecture</w:t>
+      </w:r>
+    </w:p>
+    <w:p>
+      <w:pPr>
+        <w:spacing w:after="200"/>
+      </w:pPr>
+      <w:r>
+        <w:t xml:space="preserve">Created the initial database migration supabase/migrations/0001_init.sql featuring 9 core tables (teams, profiles, schedule_events, problem_statements, announcements, leaderboard_entries, bus_routes, bus_stops, bus_route_paths). Enforces UUID primary keys with gen_random_uuid(), timestamptz columns, and RLS on every table. Key security assets include security definer functions (is_organizer, next_problem_release, server_now), a before-update trigger preventing non-organizers from altering their role or team_id, locked problem releases (release_at &lt;= now()), locked leaderboard entries (published = true), a security-invoker leaderboard_view with dense_rank() and round breakdowns, and realtime publication registration with full replica identity.</w:t>
       </w:r>
     </w:p>
     <w:p>

</xml_diff>

<commit_message>
feat(admin): add seed.sql, participant import, organizer creation, and admin docs
</commit_message>
<xml_diff>
--- a/docs/Prayatna_Companion_Progress_Report.docx
+++ b/docs/Prayatna_Companion_Progress_Report.docx
@@ -1099,10 +1099,34 @@
     </w:p>
     <w:p>
       <w:pPr>
+        <w:spacing w:after="140"/>
+      </w:pPr>
+      <w:r>
+        <w:t xml:space="preserve">Created the initial database migration supabase/migrations/0001_init.sql featuring 9 core tables (teams, profiles, schedule_events, problem_statements, announcements, leaderboard_entries, bus_routes, bus_stops, bus_route_paths). Enforces UUID primary keys with gen_random_uuid(), timestamptz columns, and RLS on every table. Key security assets include security definer functions (is_organizer, next_problem_release, server_now), a before-update trigger preventing non-organizers from altering their role or team_id, locked problem releases (release_at &lt;= now()), locked leaderboard entries (published = true), a security-invoker leaderboard_view with dense_rank() and round breakdowns, and realtime publication registration with full replica identity.</w:t>
+      </w:r>
+    </w:p>
+    <w:p>
+      <w:pPr>
+        <w:pStyle w:val="Heading2"/>
+        <w:spacing w:after="80" w:before="140"/>
+      </w:pPr>
+      <w:r>
+        <w:rPr>
+          <w:b/>
+          <w:bCs/>
+          <w:color w:val="0F172A"/>
+          <w:sz w:val="26"/>
+          <w:szCs w:val="26"/>
+        </w:rPr>
+        <w:t xml:space="preserve">3.6 Seed Data, Administrative CLI Automation &amp; Documentation</w:t>
+      </w:r>
+    </w:p>
+    <w:p>
+      <w:pPr>
         <w:spacing w:after="200"/>
       </w:pPr>
       <w:r>
-        <w:t xml:space="preserve">Created the initial database migration supabase/migrations/0001_init.sql featuring 9 core tables (teams, profiles, schedule_events, problem_statements, announcements, leaderboard_entries, bus_routes, bus_stops, bus_route_paths). Enforces UUID primary keys with gen_random_uuid(), timestamptz columns, and RLS on every table. Key security assets include security definer functions (is_organizer, next_problem_release, server_now), a before-update trigger preventing non-organizers from altering their role or team_id, locked problem releases (release_at &lt;= now()), locked leaderboard entries (published = true), a security-invoker leaderboard_view with dense_rank() and round breakdowns, and realtime publication registration with full replica identity.</w:t>
+        <w:t xml:space="preserve">Implemented realistic seed dataset supabase/seed.sql (3 teams, 10 schedule events with midnight crossover, 4 problem statements with past and future release windows, 3 prioritized announcements, 2 transit routes for Indore and Bhopal with 5 stops each and geo-coordinates, and a published leaderboard with a 175-point tie). Built administrative CLI scripts scripts/import-participants.ts (bulk participant provisioning, team upserts, temporary password generation, rate limiting, and credentials.csv export) and scripts/create-organizer.ts (direct organizer provisioning), documented thoroughly in docs/ADMIN.md.</w:t>
       </w:r>
     </w:p>
     <w:p>

</xml_diff>

<commit_message>
feat(ui): build themeable design system, composed skeletons, and ScreenState
</commit_message>
<xml_diff>
--- a/docs/Prayatna_Companion_Progress_Report.docx
+++ b/docs/Prayatna_Companion_Progress_Report.docx
@@ -1123,10 +1123,34 @@
     </w:p>
     <w:p>
       <w:pPr>
+        <w:spacing w:after="140"/>
+      </w:pPr>
+      <w:r>
+        <w:t xml:space="preserve">Implemented realistic seed dataset supabase/seed.sql (3 teams, 10 schedule events with midnight crossover, 4 problem statements with past and future release windows, 3 prioritized announcements, 2 transit routes for Indore and Bhopal with 5 stops each and geo-coordinates, and a published leaderboard with a 175-point tie). Built administrative CLI scripts scripts/import-participants.ts (bulk participant provisioning, team upserts, temporary password generation, rate limiting, and credentials.csv export) and scripts/create-organizer.ts (direct organizer provisioning), documented thoroughly in docs/ADMIN.md.</w:t>
+      </w:r>
+    </w:p>
+    <w:p>
+      <w:pPr>
+        <w:pStyle w:val="Heading2"/>
+        <w:spacing w:after="80" w:before="140"/>
+      </w:pPr>
+      <w:r>
+        <w:rPr>
+          <w:b/>
+          <w:bCs/>
+          <w:color w:val="0F172A"/>
+          <w:sz w:val="26"/>
+          <w:szCs w:val="26"/>
+        </w:rPr>
+        <w:t xml:space="preserve">3.7 Themeable Design System, Composed Skeletons &amp; ScreenState</w:t>
+      </w:r>
+    </w:p>
+    <w:p>
+      <w:pPr>
         <w:spacing w:after="200"/>
       </w:pPr>
       <w:r>
-        <w:t xml:space="preserve">Implemented realistic seed dataset supabase/seed.sql (3 teams, 10 schedule events with midnight crossover, 4 problem statements with past and future release windows, 3 prioritized announcements, 2 transit routes for Indore and Bhopal with 5 stops each and geo-coordinates, and a published leaderboard with a 175-point tie). Built administrative CLI scripts scripts/import-participants.ts (bulk participant provisioning, team upserts, temporary password generation, rate limiting, and credentials.csv export) and scripts/create-organizer.ts (direct organizer provisioning), documented thoroughly in docs/ADMIN.md.</w:t>
+        <w:t xml:space="preserve">Developed a full themeable design system in src/shared/ui/ including Text (9 typography variants with dynamic font scaling), Button (primary, secondary, ghost, outline, danger with loading spinner and disabled states), Card (default, elevated, outlined, glow with haptics), Badge &amp; Chip (semantic pill badges and selectable filter chips), Input (focus rings, error alerts, helper texts), Avatar (initials generation, presence status dots), Divider (horizontal, vertical, and labeled), and BottomSheet (slide-up dialog with gesture backdrop dismiss). Engineered a Reanimated shimmer Skeleton primitive respecting device reduce-motion settings, along with 7 composed skeletons matching exact production layouts (Home, Schedule, Announcements, Problems, Leaderboard podium, Transit, Profile). Standardized the 5-State Architecture through ScreenState coordinating TanStack Query results, ErrorState with refetch, EmptyState with custom actions, and NetInfo-driven OfflineBanner. Included an isolated developer-only preview screen app/dev/ui-kit.tsx.</w:t>
       </w:r>
     </w:p>
     <w:p>
@@ -1672,7 +1696,7 @@
                 <w:sz w:val="19"/>
                 <w:szCs w:val="19"/>
               </w:rPr>
-              <w:t xml:space="preserve">10 test suites passed, 60/60 tests green. &gt; 80% coverage.</w:t>
+              <w:t xml:space="preserve">19 test suites passed, 117/117 tests green. &gt; 80% coverage.</w:t>
             </w:r>
           </w:p>
         </w:tc>
@@ -2351,7 +2375,7 @@
                 <w:sz w:val="19"/>
                 <w:szCs w:val="19"/>
               </w:rPr>
-              <w:t xml:space="preserve">src/shared/ui/ (5 States, Skeletons, Errors)</w:t>
+              <w:t xml:space="preserve">src/shared/ui/ (Design System &amp; Skeletons)</w:t>
             </w:r>
           </w:p>
         </w:tc>
@@ -2376,7 +2400,7 @@
                 <w:sz w:val="19"/>
                 <w:szCs w:val="19"/>
               </w:rPr>
-              <w:t xml:space="preserve">100%</w:t>
+              <w:t xml:space="preserve">94.44%</w:t>
             </w:r>
           </w:p>
         </w:tc>
@@ -2401,7 +2425,7 @@
                 <w:sz w:val="19"/>
                 <w:szCs w:val="19"/>
               </w:rPr>
-              <w:t xml:space="preserve">72.72%</w:t>
+              <w:t xml:space="preserve">83.81%</w:t>
             </w:r>
           </w:p>
         </w:tc>
@@ -2451,7 +2475,7 @@
                 <w:sz w:val="19"/>
                 <w:szCs w:val="19"/>
               </w:rPr>
-              <w:t xml:space="preserve">100%</w:t>
+              <w:t xml:space="preserve">95.52%</w:t>
             </w:r>
           </w:p>
         </w:tc>
@@ -2625,7 +2649,7 @@
                 <w:sz w:val="19"/>
                 <w:szCs w:val="19"/>
               </w:rPr>
-              <w:t xml:space="preserve">97.27%</w:t>
+              <w:t xml:space="preserve">95.32%</w:t>
             </w:r>
           </w:p>
         </w:tc>
@@ -2650,7 +2674,7 @@
                 <w:sz w:val="19"/>
                 <w:szCs w:val="19"/>
               </w:rPr>
-              <w:t xml:space="preserve">83.67%</w:t>
+              <w:t xml:space="preserve">84.69%</w:t>
             </w:r>
           </w:p>
         </w:tc>
@@ -2675,7 +2699,7 @@
                 <w:sz w:val="19"/>
                 <w:szCs w:val="19"/>
               </w:rPr>
-              <w:t xml:space="preserve">85.10%</w:t>
+              <w:t xml:space="preserve">91.95%</w:t>
             </w:r>
           </w:p>
         </w:tc>
@@ -2700,7 +2724,7 @@
                 <w:sz w:val="19"/>
                 <w:szCs w:val="19"/>
               </w:rPr>
-              <w:t xml:space="preserve">97.60%</w:t>
+              <w:t xml:space="preserve">96.11%</w:t>
             </w:r>
           </w:p>
         </w:tc>

</xml_diff>

<commit_message>
feat(core): add database types, domain schemas, error layer, query persistence, server-time, and realtime manager
</commit_message>
<xml_diff>
--- a/docs/Prayatna_Companion_Progress_Report.docx
+++ b/docs/Prayatna_Companion_Progress_Report.docx
@@ -1147,10 +1147,34 @@
     </w:p>
     <w:p>
       <w:pPr>
+        <w:spacing w:after="140"/>
+      </w:pPr>
+      <w:r>
+        <w:t xml:space="preserve">Developed a full themeable design system in src/shared/ui/ including Text (9 typography variants with dynamic font scaling), Button (primary, secondary, ghost, outline, danger with loading spinner and disabled states), Card (default, elevated, outlined, glow with haptics), Badge &amp; Chip (semantic pill badges and selectable filter chips), Input (focus rings, error alerts, helper texts), Avatar (initials generation, presence status dots), Divider (horizontal, vertical, and labeled), and BottomSheet (slide-up dialog with gesture backdrop dismiss). Engineered a Reanimated shimmer Skeleton primitive respecting device reduce-motion settings, along with 7 composed skeletons matching exact production layouts (Home, Schedule, Announcements, Problems, Leaderboard podium, Transit, Profile). Standardized the 5-State Architecture through ScreenState coordinating TanStack Query results, ErrorState with refetch, EmptyState with custom actions, and NetInfo-driven OfflineBanner. Included an isolated developer-only preview screen app/dev/ui-kit.tsx.</w:t>
+      </w:r>
+    </w:p>
+    <w:p>
+      <w:pPr>
+        <w:pStyle w:val="Heading2"/>
+        <w:spacing w:after="80" w:before="140"/>
+      </w:pPr>
+      <w:r>
+        <w:rPr>
+          <w:b/>
+          <w:bCs/>
+          <w:color w:val="0F172A"/>
+          <w:sz w:val="26"/>
+          <w:szCs w:val="26"/>
+        </w:rPr>
+        <w:t xml:space="preserve">3.8 Data Layer, Synchronization, Error Mapping &amp; Realtime Architecture</w:t>
+      </w:r>
+    </w:p>
+    <w:p>
+      <w:pPr>
         <w:spacing w:after="200"/>
       </w:pPr>
       <w:r>
-        <w:t xml:space="preserve">Developed a full themeable design system in src/shared/ui/ including Text (9 typography variants with dynamic font scaling), Button (primary, secondary, ghost, outline, danger with loading spinner and disabled states), Card (default, elevated, outlined, glow with haptics), Badge &amp; Chip (semantic pill badges and selectable filter chips), Input (focus rings, error alerts, helper texts), Avatar (initials generation, presence status dots), Divider (horizontal, vertical, and labeled), and BottomSheet (slide-up dialog with gesture backdrop dismiss). Engineered a Reanimated shimmer Skeleton primitive respecting device reduce-motion settings, along with 7 composed skeletons matching exact production layouts (Home, Schedule, Announcements, Problems, Leaderboard podium, Transit, Profile). Standardized the 5-State Architecture through ScreenState coordinating TanStack Query results, ErrorState with refetch, EmptyState with custom actions, and NetInfo-driven OfflineBanner. Included an isolated developer-only preview screen app/dev/ui-kit.tsx.</w:t>
+        <w:t xml:space="preserve">Engineered an enterprise data synchronization foundation featuring: (1) Generated Supabase TypeScript types with automated npm script "gen:types" and comprehensive Zod schemas across all feature domains (teams, profile, schedule, problems, announcements, leaderboard, transit) with strict type derivation. (2) Centralized error handling layer with typed AppError class and mapToAppError() translating PostgREST, Supabase Auth, network drops, timeouts, and Zod errors to friendly user messages, guaranteeing raw errors and secrets are never surfaced to the UI. (3) TanStack Query setup with resource-specific stale times (schedule 60s, announcements 15s, leaderboard 10s, problems 30s, bus 10min), exponential backoff retries exclusively on retryable errors, focusManager &amp; onlineManager synchronization, and AsyncStorage persistence. (4) Server time synchronization calling RPC server_now() with latency adjustment, exposing useServerNow() for accurate live countdowns. (5) Resilient Realtime Manager subscribing to database tables with reference counting, automatic reconnection with backoff, 30s polling fallback, and cache invalidation. (6) Centralized IST date utilities for calendar day grouping across midnight, active/upcoming event resolution, and countdown formatting.</w:t>
       </w:r>
     </w:p>
     <w:p>
@@ -1696,7 +1720,7 @@
                 <w:sz w:val="19"/>
                 <w:szCs w:val="19"/>
               </w:rPr>
-              <w:t xml:space="preserve">19 test suites passed, 117/117 tests green. &gt; 80% coverage.</w:t>
+              <w:t xml:space="preserve">23 test suites passed, 193/193 tests green. &gt; 80% coverage.</w:t>
             </w:r>
           </w:p>
         </w:tc>
@@ -2003,7 +2027,7 @@
                 <w:sz w:val="19"/>
                 <w:szCs w:val="19"/>
               </w:rPr>
-              <w:t xml:space="preserve">src/features/ (Auth Store)</w:t>
+              <w:t xml:space="preserve">src/features/ (Domain Schemas, Auth)</w:t>
             </w:r>
           </w:p>
         </w:tc>
@@ -2126,7 +2150,7 @@
                 <w:sz w:val="19"/>
                 <w:szCs w:val="19"/>
               </w:rPr>
-              <w:t xml:space="preserve">src/shared/hooks/ (Theme)</w:t>
+              <w:t xml:space="preserve">src/shared/hooks/ (Theme, Server Time)</w:t>
             </w:r>
           </w:p>
         </w:tc>
@@ -2151,7 +2175,7 @@
                 <w:sz w:val="19"/>
                 <w:szCs w:val="19"/>
               </w:rPr>
-              <w:t xml:space="preserve">100%</w:t>
+              <w:t xml:space="preserve">93.75%</w:t>
             </w:r>
           </w:p>
         </w:tc>
@@ -2176,7 +2200,7 @@
                 <w:sz w:val="19"/>
                 <w:szCs w:val="19"/>
               </w:rPr>
-              <w:t xml:space="preserve">100%</w:t>
+              <w:t xml:space="preserve">75.00%</w:t>
             </w:r>
           </w:p>
         </w:tc>
@@ -2201,7 +2225,7 @@
                 <w:sz w:val="19"/>
                 <w:szCs w:val="19"/>
               </w:rPr>
-              <w:t xml:space="preserve">100%</w:t>
+              <w:t xml:space="preserve">92.85%</w:t>
             </w:r>
           </w:p>
         </w:tc>
@@ -2226,7 +2250,7 @@
                 <w:sz w:val="19"/>
                 <w:szCs w:val="19"/>
               </w:rPr>
-              <w:t xml:space="preserve">100%</w:t>
+              <w:t xml:space="preserve">93.10%</w:t>
             </w:r>
           </w:p>
         </w:tc>
@@ -2252,7 +2276,7 @@
                 <w:sz w:val="19"/>
                 <w:szCs w:val="19"/>
               </w:rPr>
-              <w:t xml:space="preserve">src/shared/lib/ (Logger, Sentry, Supabase)</w:t>
+              <w:t xml:space="preserve">src/shared/lib/ (Errors, Realtime, Time, etc.)</w:t>
             </w:r>
           </w:p>
         </w:tc>
@@ -2276,7 +2300,7 @@
                 <w:sz w:val="19"/>
                 <w:szCs w:val="19"/>
               </w:rPr>
-              <w:t xml:space="preserve">95.52%</w:t>
+              <w:t xml:space="preserve">93.91%</w:t>
             </w:r>
           </w:p>
         </w:tc>
@@ -2300,7 +2324,7 @@
                 <w:sz w:val="19"/>
                 <w:szCs w:val="19"/>
               </w:rPr>
-              <w:t xml:space="preserve">83.33%</w:t>
+              <w:t xml:space="preserve">83.93%</w:t>
             </w:r>
           </w:p>
         </w:tc>
@@ -2324,7 +2348,7 @@
                 <w:sz w:val="19"/>
                 <w:szCs w:val="19"/>
               </w:rPr>
-              <w:t xml:space="preserve">70.83%</w:t>
+              <w:t xml:space="preserve">81.96%</w:t>
             </w:r>
           </w:p>
         </w:tc>
@@ -2348,7 +2372,7 @@
                 <w:sz w:val="19"/>
                 <w:szCs w:val="19"/>
               </w:rPr>
-              <w:t xml:space="preserve">96.00%</w:t>
+              <w:t xml:space="preserve">94.01%</w:t>
             </w:r>
           </w:p>
         </w:tc>
@@ -2525,7 +2549,7 @@
                 <w:sz w:val="19"/>
                 <w:szCs w:val="19"/>
               </w:rPr>
-              <w:t xml:space="preserve">100%</w:t>
+              <w:t xml:space="preserve">98.94%</w:t>
             </w:r>
           </w:p>
         </w:tc>
@@ -2549,7 +2573,7 @@
                 <w:sz w:val="19"/>
                 <w:szCs w:val="19"/>
               </w:rPr>
-              <w:t xml:space="preserve">95.83%</w:t>
+              <w:t xml:space="preserve">89.23%</w:t>
             </w:r>
           </w:p>
         </w:tc>
@@ -2649,7 +2673,7 @@
                 <w:sz w:val="19"/>
                 <w:szCs w:val="19"/>
               </w:rPr>
-              <w:t xml:space="preserve">95.32%</w:t>
+              <w:t xml:space="preserve">94.84%</w:t>
             </w:r>
           </w:p>
         </w:tc>
@@ -2674,7 +2698,7 @@
                 <w:sz w:val="19"/>
                 <w:szCs w:val="19"/>
               </w:rPr>
-              <w:t xml:space="preserve">84.69%</w:t>
+              <w:t xml:space="preserve">84.48%</w:t>
             </w:r>
           </w:p>
         </w:tc>
@@ -2699,7 +2723,7 @@
                 <w:sz w:val="19"/>
                 <w:szCs w:val="19"/>
               </w:rPr>
-              <w:t xml:space="preserve">91.95%</w:t>
+              <w:t xml:space="preserve">91.66%</w:t>
             </w:r>
           </w:p>
         </w:tc>
@@ -2724,7 +2748,7 @@
                 <w:sz w:val="19"/>
                 <w:szCs w:val="19"/>
               </w:rPr>
-              <w:t xml:space="preserve">96.11%</w:t>
+              <w:t xml:space="preserve">95.40%</w:t>
             </w:r>
           </w:p>
         </w:tc>

</xml_diff>

<commit_message>
feat(auth): implement login screen, session watcher, profile card, more tab, and cache purge
</commit_message>
<xml_diff>
--- a/docs/Prayatna_Companion_Progress_Report.docx
+++ b/docs/Prayatna_Companion_Progress_Report.docx
@@ -1175,6 +1175,30 @@
       </w:pPr>
       <w:r>
         <w:t xml:space="preserve">Engineered an enterprise data synchronization foundation featuring: (1) Generated Supabase TypeScript types with automated npm script "gen:types" and comprehensive Zod schemas across all feature domains (teams, profile, schedule, problems, announcements, leaderboard, transit) with strict type derivation. (2) Centralized error handling layer with typed AppError class and mapToAppError() translating PostgREST, Supabase Auth, network drops, timeouts, and Zod errors to friendly user messages, guaranteeing raw errors and secrets are never surfaced to the UI. (3) TanStack Query setup with resource-specific stale times (schedule 60s, announcements 15s, leaderboard 10s, problems 30s, bus 10min), exponential backoff retries exclusively on retryable errors, focusManager &amp; onlineManager synchronization, and AsyncStorage persistence. (4) Server time synchronization calling RPC server_now() with latency adjustment, exposing useServerNow() for accurate live countdowns. (5) Resilient Realtime Manager subscribing to database tables with reference counting, automatic reconnection with backoff, 30s polling fallback, and cache invalidation. (6) Centralized IST date utilities for calendar day grouping across midnight, active/upcoming event resolution, and countdown formatting.</w:t>
+      </w:r>
+    </w:p>
+    <w:p>
+      <w:pPr>
+        <w:pStyle w:val="Heading2"/>
+        <w:spacing w:after="80" w:before="140"/>
+      </w:pPr>
+      <w:r>
+        <w:rPr>
+          <w:b/>
+          <w:bCs/>
+          <w:color w:val="0F172A"/>
+          <w:sz w:val="26"/>
+          <w:szCs w:val="26"/>
+        </w:rPr>
+        <w:t xml:space="preserve">3.9 Authentication Feature, Protected Session Gate, Profile Watcher &amp; More Tab</w:t>
+      </w:r>
+    </w:p>
+    <w:p>
+      <w:pPr>
+        <w:spacing w:after="200"/>
+      </w:pPr>
+      <w:r>
+        <w:t xml:space="preserve">Delivered the end-to-end hacker authentication and profile management system: (1) Hacker Login Screen (app/(auth)/login.tsx) with dark/light theming, email &amp; password fields with inline Zod validation, password show/hide toggle, loading indicator on submission, distinct messages for invalid credentials vs network errors, and "Forgot password? Contact the organizers." notice without public self-registration. (2) Reactive useSession hook providing session state and flash notices (authNotice) for redirect warnings. (3) TanStack Query useProfile hook joining profiles with teams, auto-enforcing sign-out if a profile row is missing or if the token is revoked/account deleted. (4) Cold start zero-flicker splash screen pre-verification in app/_layout.tsx ensuring authenticated users transition smoothly to tabs while invalid sessions land on login. (5) Account &amp; More Tab (app/(tabs)/more.tsx) with 5-state presentation, ProfileCard displaying participant initials avatar, online badge, team name, and squad code, hackathon Wi-Fi / help desk resources card, native confirmation sign-out dialogs, and cache purging (both in-memory TanStack query cache and persisted AsyncStorage cache) on logout.</w:t>
       </w:r>
     </w:p>
     <w:p>
@@ -1720,7 +1744,7 @@
                 <w:sz w:val="19"/>
                 <w:szCs w:val="19"/>
               </w:rPr>
-              <w:t xml:space="preserve">23 test suites passed, 193/193 tests green. &gt; 80% coverage.</w:t>
+              <w:t xml:space="preserve">29 test suites passed, 224/224 tests green. &gt; 80% coverage.</w:t>
             </w:r>
           </w:p>
         </w:tc>
@@ -2051,7 +2075,7 @@
                 <w:sz w:val="19"/>
                 <w:szCs w:val="19"/>
               </w:rPr>
-              <w:t xml:space="preserve">100%</w:t>
+              <w:t xml:space="preserve">97.46%</w:t>
             </w:r>
           </w:p>
         </w:tc>
@@ -2075,7 +2099,7 @@
                 <w:sz w:val="19"/>
                 <w:szCs w:val="19"/>
               </w:rPr>
-              <w:t xml:space="preserve">100%</w:t>
+              <w:t xml:space="preserve">82.35%</w:t>
             </w:r>
           </w:p>
         </w:tc>
@@ -2099,7 +2123,7 @@
                 <w:sz w:val="19"/>
                 <w:szCs w:val="19"/>
               </w:rPr>
-              <w:t xml:space="preserve">100%</w:t>
+              <w:t xml:space="preserve">96.66%</w:t>
             </w:r>
           </w:p>
         </w:tc>
@@ -2123,7 +2147,7 @@
                 <w:sz w:val="19"/>
                 <w:szCs w:val="19"/>
               </w:rPr>
-              <w:t xml:space="preserve">100%</w:t>
+              <w:t xml:space="preserve">97.26%</w:t>
             </w:r>
           </w:p>
         </w:tc>
@@ -2324,7 +2348,7 @@
                 <w:sz w:val="19"/>
                 <w:szCs w:val="19"/>
               </w:rPr>
-              <w:t xml:space="preserve">83.93%</w:t>
+              <w:t xml:space="preserve">85.71%</w:t>
             </w:r>
           </w:p>
         </w:tc>
@@ -2372,7 +2396,7 @@
                 <w:sz w:val="19"/>
                 <w:szCs w:val="19"/>
               </w:rPr>
-              <w:t xml:space="preserve">94.01%</w:t>
+              <w:t xml:space="preserve">94.03%</w:t>
             </w:r>
           </w:p>
         </w:tc>
@@ -2424,7 +2448,7 @@
                 <w:sz w:val="19"/>
                 <w:szCs w:val="19"/>
               </w:rPr>
-              <w:t xml:space="preserve">94.44%</w:t>
+              <w:t xml:space="preserve">94.84%</w:t>
             </w:r>
           </w:p>
         </w:tc>
@@ -2449,7 +2473,7 @@
                 <w:sz w:val="19"/>
                 <w:szCs w:val="19"/>
               </w:rPr>
-              <w:t xml:space="preserve">83.81%</w:t>
+              <w:t xml:space="preserve">86.33%</w:t>
             </w:r>
           </w:p>
         </w:tc>
@@ -2499,7 +2523,7 @@
                 <w:sz w:val="19"/>
                 <w:szCs w:val="19"/>
               </w:rPr>
-              <w:t xml:space="preserve">95.52%</w:t>
+              <w:t xml:space="preserve">95.93%</w:t>
             </w:r>
           </w:p>
         </w:tc>
@@ -2673,7 +2697,7 @@
                 <w:sz w:val="19"/>
                 <w:szCs w:val="19"/>
               </w:rPr>
-              <w:t xml:space="preserve">94.84%</w:t>
+              <w:t xml:space="preserve">95.19%</w:t>
             </w:r>
           </w:p>
         </w:tc>
@@ -2698,7 +2722,7 @@
                 <w:sz w:val="19"/>
                 <w:szCs w:val="19"/>
               </w:rPr>
-              <w:t xml:space="preserve">84.48%</w:t>
+              <w:t xml:space="preserve">86.19%</w:t>
             </w:r>
           </w:p>
         </w:tc>
@@ -2723,7 +2747,7 @@
                 <w:sz w:val="19"/>
                 <w:szCs w:val="19"/>
               </w:rPr>
-              <w:t xml:space="preserve">91.66%</w:t>
+              <w:t xml:space="preserve">92.77%</w:t>
             </w:r>
           </w:p>
         </w:tc>
@@ -2748,7 +2772,7 @@
                 <w:sz w:val="19"/>
                 <w:szCs w:val="19"/>
               </w:rPr>
-              <w:t xml:space="preserve">95.40%</w:t>
+              <w:t xml:space="preserve">95.64%</w:t>
             </w:r>
           </w:p>
         </w:tc>

</xml_diff>

<commit_message>
feat: build real-time schedule, announcements, and home overview features
</commit_message>
<xml_diff>
--- a/docs/Prayatna_Companion_Progress_Report.docx
+++ b/docs/Prayatna_Companion_Progress_Report.docx
@@ -1198,7 +1198,31 @@
         <w:spacing w:after="200"/>
       </w:pPr>
       <w:r>
-        <w:t xml:space="preserve">Delivered the end-to-end hacker authentication and profile management system: (1) Hacker Login Screen (app/(auth)/login.tsx) with dark/light theming, email &amp; password fields with inline Zod validation, password show/hide toggle, loading indicator on submission, distinct messages for invalid credentials vs network errors, and "Forgot password? Contact the organizers." notice without public self-registration. (2) Reactive useSession hook providing session state and flash notices (authNotice) for redirect warnings. (3) TanStack Query useProfile hook joining profiles with teams, auto-enforcing sign-out if a profile row is missing or if the token is revoked/account deleted. (4) Cold start zero-flicker splash screen pre-verification in app/_layout.tsx ensuring authenticated users transition smoothly to tabs while invalid sessions land on login. (5) Account &amp; More Tab (app/(tabs)/more.tsx) with 5-state presentation, ProfileCard displaying participant initials avatar, online badge, team name, and squad code, hackathon Wi-Fi / help desk resources card, native confirmation sign-out dialogs, and cache purging (both in-memory TanStack query cache and persisted AsyncStorage cache) on logout.</w:t>
+        <w:t xml:space="preserve">Delivered the end-to-end hacker authentication and profile management system: (1) Hacker Login Screen (app/(auth)/login.tsx) with dark/light theming, email &amp; password fields with inline Zod validation, password show/hide toggle, loading indicator on submission, distinct messages for invalid credentials vs network errors, and "Forgot password? Contact the organizers." notice without public self-registration. (2) Reactive useSession hook providing session state and flash notices (authNotice) for redirect warnings. (3) TanStack Query useProfile hook joining profiles with teams, auto-enforcing sign-out if a profile row is missing or if the token is revoked/account deleted. (4) Cold start zero-flicker splash screen pre-verification in app/_layout.tsx ensuring authenticated users transition smoothly to tabs while invalid sessions land on login. (5) Account &amp; More Tab (app/(tabs)/more.tsx) with 5-state presentation, ProfileCard displaying participant initials avatar, online badge, team name, and squad code, direct navigation to Announcements Feed, hackathon Wi-Fi / help desk resources card, native confirmation sign-out dialogs, and cache purging (both in-memory TanStack query cache and persisted AsyncStorage cache) on logout.</w:t>
+      </w:r>
+    </w:p>
+    <w:p>
+      <w:pPr>
+        <w:pStyle w:val="Heading2"/>
+        <w:spacing w:after="80" w:before="140"/>
+      </w:pPr>
+      <w:r>
+        <w:rPr>
+          <w:b/>
+          <w:bCs/>
+          <w:color w:val="0F172A"/>
+          <w:sz w:val="26"/>
+          <w:szCs w:val="26"/>
+        </w:rPr>
+        <w:t xml:space="preserve">3.10 Real-Time Event Features: Schedule, Announcements, &amp; Live Home Dashboard</w:t>
+      </w:r>
+    </w:p>
+    <w:p>
+      <w:pPr>
+        <w:spacing w:after="200"/>
+      </w:pPr>
+      <w:r>
+        <w:t xml:space="preserve">Engineered core interactive event features integrating Supabase Realtime synchronization and authoritative server-corrected time: (1) Schedule Timeline (app/(tabs)/schedule.tsx): Segmented control day selector ("All Days", "Day 1", "Day 2", etc.), timeline event list showing IST time range, venue location with pin indicator, and colored chips per event type (ceremony, session, workshop, jamming, judging, meal, other). Live highlight for current active event with glowing border and "LIVE NOW" badge. Server-corrected authoritative time ticking every 30s via useServerNow({ intervalMs: 30000 }) automatically advancing active events. Full handling of midnight-crossing events (visible on both days with a "(+1 Day)" indicator) and concurrent overlapping events. 5-state handling with ScheduleSkeleton, EmptyState, ErrorState with retry, OfflineBanner, and pull-to-refresh. (2) Announcements Feed (app/announcements.tsx): Reverse-chronological feed with priority badges (normal, important, urgent with red left border and warning tint), relative timestamps (Just now, 5m ago, 2h ago, 3d ago, or IST date) via formatRelativeTime(), expandable long text with smooth 3-line truncation and accessible toggle button (touch target &gt;= 44px), priority filter chips ("All", "Urgent", "Important"), back navigation, and 5-state handling with AnnouncementListSkeleton. (3) Home Overview Dashboard (app/(tabs)/index.tsx): Welcomes participant by first name (useProfile), displaying team name and squad code. "Happening Now / Up Next" hero card with live IST event time, category badge, location, and high-visibility countdown timer updating every second via useServerNow({ intervalMs: 1000 }). Latest 3 announcements preview with immediate shortcut ("View all →") to full announcements feed. Zero-layout-shift HomeSkeleton loading state and multi-resource pull-to-refresh. (4) Realtime Synchronization: Subscribed to schedule_events and announcements tables with automatic query cache invalidation on inserts, updates, and deletes.</w:t>
       </w:r>
     </w:p>
     <w:p>
@@ -1744,7 +1768,7 @@
                 <w:sz w:val="19"/>
                 <w:szCs w:val="19"/>
               </w:rPr>
-              <w:t xml:space="preserve">29 test suites passed, 224/224 tests green. &gt; 80% coverage.</w:t>
+              <w:t xml:space="preserve">40 test suites passed, 278/278 tests green. &gt; 80% coverage.</w:t>
             </w:r>
           </w:p>
         </w:tc>
@@ -2051,7 +2075,7 @@
                 <w:sz w:val="19"/>
                 <w:szCs w:val="19"/>
               </w:rPr>
-              <w:t xml:space="preserve">src/features/ (Domain Schemas, Auth)</w:t>
+              <w:t xml:space="preserve">src/features/ (Schedule, Announcements, Auth)</w:t>
             </w:r>
           </w:p>
         </w:tc>
@@ -2075,7 +2099,7 @@
                 <w:sz w:val="19"/>
                 <w:szCs w:val="19"/>
               </w:rPr>
-              <w:t xml:space="preserve">97.46%</w:t>
+              <w:t xml:space="preserve">95.78%</w:t>
             </w:r>
           </w:p>
         </w:tc>
@@ -2099,7 +2123,7 @@
                 <w:sz w:val="19"/>
                 <w:szCs w:val="19"/>
               </w:rPr>
-              <w:t xml:space="preserve">82.35%</w:t>
+              <w:t xml:space="preserve">84.15%</w:t>
             </w:r>
           </w:p>
         </w:tc>
@@ -2123,7 +2147,7 @@
                 <w:sz w:val="19"/>
                 <w:szCs w:val="19"/>
               </w:rPr>
-              <w:t xml:space="preserve">96.66%</w:t>
+              <w:t xml:space="preserve">94.73%</w:t>
             </w:r>
           </w:p>
         </w:tc>
@@ -2147,7 +2171,7 @@
                 <w:sz w:val="19"/>
                 <w:szCs w:val="19"/>
               </w:rPr>
-              <w:t xml:space="preserve">97.26%</w:t>
+              <w:t xml:space="preserve">95.80%</w:t>
             </w:r>
           </w:p>
         </w:tc>
@@ -2199,7 +2223,7 @@
                 <w:sz w:val="19"/>
                 <w:szCs w:val="19"/>
               </w:rPr>
-              <w:t xml:space="preserve">93.75%</w:t>
+              <w:t xml:space="preserve">96.87%</w:t>
             </w:r>
           </w:p>
         </w:tc>
@@ -2224,7 +2248,7 @@
                 <w:sz w:val="19"/>
                 <w:szCs w:val="19"/>
               </w:rPr>
-              <w:t xml:space="preserve">75.00%</w:t>
+              <w:t xml:space="preserve">87.50%</w:t>
             </w:r>
           </w:p>
         </w:tc>
@@ -2274,7 +2298,7 @@
                 <w:sz w:val="19"/>
                 <w:szCs w:val="19"/>
               </w:rPr>
-              <w:t xml:space="preserve">93.10%</w:t>
+              <w:t xml:space="preserve">96.55%</w:t>
             </w:r>
           </w:p>
         </w:tc>
@@ -2573,7 +2597,7 @@
                 <w:sz w:val="19"/>
                 <w:szCs w:val="19"/>
               </w:rPr>
-              <w:t xml:space="preserve">98.94%</w:t>
+              <w:t xml:space="preserve">99.12%</w:t>
             </w:r>
           </w:p>
         </w:tc>
@@ -2597,7 +2621,7 @@
                 <w:sz w:val="19"/>
                 <w:szCs w:val="19"/>
               </w:rPr>
-              <w:t xml:space="preserve">89.23%</w:t>
+              <w:t xml:space="preserve">90.00%</w:t>
             </w:r>
           </w:p>
         </w:tc>
@@ -2697,7 +2721,7 @@
                 <w:sz w:val="19"/>
                 <w:szCs w:val="19"/>
               </w:rPr>
-              <w:t xml:space="preserve">95.19%</w:t>
+              <w:t xml:space="preserve">95.26%</w:t>
             </w:r>
           </w:p>
         </w:tc>
@@ -2722,7 +2746,7 @@
                 <w:sz w:val="19"/>
                 <w:szCs w:val="19"/>
               </w:rPr>
-              <w:t xml:space="preserve">86.19%</w:t>
+              <w:t xml:space="preserve">87.24%</w:t>
             </w:r>
           </w:p>
         </w:tc>
@@ -2747,7 +2771,7 @@
                 <w:sz w:val="19"/>
                 <w:szCs w:val="19"/>
               </w:rPr>
-              <w:t xml:space="preserve">92.77%</w:t>
+              <w:t xml:space="preserve">93.12%</w:t>
             </w:r>
           </w:p>
         </w:tc>
@@ -2772,7 +2796,7 @@
                 <w:sz w:val="19"/>
                 <w:szCs w:val="19"/>
               </w:rPr>
-              <w:t xml:space="preserve">95.64%</w:t>
+              <w:t xml:space="preserve">95.65%</w:t>
             </w:r>
           </w:p>
         </w:tc>

</xml_diff>

<commit_message>
feat: build problem statements feature with live locked countdown and safe markdown detail view
</commit_message>
<xml_diff>
--- a/docs/Prayatna_Companion_Progress_Report.docx
+++ b/docs/Prayatna_Companion_Progress_Report.docx
@@ -1223,6 +1223,30 @@
       </w:pPr>
       <w:r>
         <w:t xml:space="preserve">Engineered core interactive event features integrating Supabase Realtime synchronization and authoritative server-corrected time: (1) Schedule Timeline (app/(tabs)/schedule.tsx): Segmented control day selector ("All Days", "Day 1", "Day 2", etc.), timeline event list showing IST time range, venue location with pin indicator, and colored chips per event type (ceremony, session, workshop, jamming, judging, meal, other). Live highlight for current active event with glowing border and "LIVE NOW" badge. Server-corrected authoritative time ticking every 30s via useServerNow({ intervalMs: 30000 }) automatically advancing active events. Full handling of midnight-crossing events (visible on both days with a "(+1 Day)" indicator) and concurrent overlapping events. 5-state handling with ScheduleSkeleton, EmptyState, ErrorState with retry, OfflineBanner, and pull-to-refresh. (2) Announcements Feed (app/announcements.tsx): Reverse-chronological feed with priority badges (normal, important, urgent with red left border and warning tint), relative timestamps (Just now, 5m ago, 2h ago, 3d ago, or IST date) via formatRelativeTime(), expandable long text with smooth 3-line truncation and accessible toggle button (touch target &gt;= 44px), priority filter chips ("All", "Urgent", "Important"), back navigation, and 5-state handling with AnnouncementListSkeleton. (3) Home Overview Dashboard (app/(tabs)/index.tsx): Welcomes participant by first name (useProfile), displaying team name and squad code. "Happening Now / Up Next" hero card with live IST event time, category badge, location, and high-visibility countdown timer updating every second via useServerNow({ intervalMs: 1000 }). Latest 3 announcements preview with immediate shortcut ("View all →") to full announcements feed. Zero-layout-shift HomeSkeleton loading state and multi-resource pull-to-refresh. (4) Realtime Synchronization: Subscribed to schedule_events and announcements tables with automatic query cache invalidation on inserts, updates, and deletes.</w:t>
+      </w:r>
+    </w:p>
+    <w:p>
+      <w:pPr>
+        <w:pStyle w:val="Heading2"/>
+        <w:spacing w:after="80" w:before="140"/>
+      </w:pPr>
+      <w:r>
+        <w:rPr>
+          <w:b/>
+          <w:bCs/>
+          <w:color w:val="0F172A"/>
+          <w:sz w:val="26"/>
+          <w:szCs w:val="26"/>
+        </w:rPr>
+        <w:t xml:space="preserve">3.11 Problem Statements Track, Live Locked Countdown &amp; Markdown Detail Screen</w:t>
+      </w:r>
+    </w:p>
+    <w:p>
+      <w:pPr>
+        <w:spacing w:after="200"/>
+      </w:pPr>
+      <w:r>
+        <w:t xml:space="preserve">Engineered the Problem Statements track discovery and secure release module: (1) Database RLS &amp; RPC Security: Problem statements are strictly protected by Postgres RLS (release_at &lt;= now() or is_organizer()), completely hiding unreleased tracks from network access. Implemented rpc next_problem_release() to retrieve upcoming countdown targets without leaking problem metadata. (2) Locked Countdown Card (LockedReleaseCard): Displays live countdown ticking every second via useServerNow({ intervalMs: 1000 }), automatically correcting for client device clock skew. Seamlessly fires onCountdownZero when timer expires, invalidating TanStack query caches and revealing newly released problem statements. Subscribed to Realtime changes on problem_statements table. (3) Problem Statements List (app/(tabs)/problems.tsx): 5-state screen architecture with ProblemCardSkeleton, ErrorState with retry, and EmptyState ("Problem statements will appear here when released") with the Locked countdown card rendered above it if an upcoming release is scheduled. FlatList with pull-to-refresh and ProblemCard items displaying code, domain, difficulty, and excerpt. (4) Safe Markdown Detail Screen (app/problems/[id].tsx &amp; MarkdownRenderer): Dedicated screen with accessible back button, metadata badges, and formatted IST release timestamp. Custom MarkdownRenderer with sanitizeHtml() stripping all HTML tags to prevent XSS/HTML injection, safely rendering headings, code blocks with syntax languages, blockquotes, ordered/unordered lists, and inline formatting for large 5,000+ character specifications.</w:t>
       </w:r>
     </w:p>
     <w:p>
@@ -1768,7 +1792,7 @@
                 <w:sz w:val="19"/>
                 <w:szCs w:val="19"/>
               </w:rPr>
-              <w:t xml:space="preserve">40 test suites passed, 278/278 tests green. &gt; 80% coverage.</w:t>
+              <w:t xml:space="preserve">49 test suites passed, 321/321 tests green. &gt; 80% coverage.</w:t>
             </w:r>
           </w:p>
         </w:tc>
@@ -2075,7 +2099,7 @@
                 <w:sz w:val="19"/>
                 <w:szCs w:val="19"/>
               </w:rPr>
-              <w:t xml:space="preserve">src/features/ (Schedule, Announcements, Auth)</w:t>
+              <w:t xml:space="preserve">src/features/ (Problems, Schedule, Announcements, Auth)</w:t>
             </w:r>
           </w:p>
         </w:tc>
@@ -2099,7 +2123,7 @@
                 <w:sz w:val="19"/>
                 <w:szCs w:val="19"/>
               </w:rPr>
-              <w:t xml:space="preserve">95.78%</w:t>
+              <w:t xml:space="preserve">95.73%</w:t>
             </w:r>
           </w:p>
         </w:tc>
@@ -2123,7 +2147,7 @@
                 <w:sz w:val="19"/>
                 <w:szCs w:val="19"/>
               </w:rPr>
-              <w:t xml:space="preserve">84.15%</w:t>
+              <w:t xml:space="preserve">83.21%</w:t>
             </w:r>
           </w:p>
         </w:tc>
@@ -2147,7 +2171,7 @@
                 <w:sz w:val="19"/>
                 <w:szCs w:val="19"/>
               </w:rPr>
-              <w:t xml:space="preserve">94.73%</w:t>
+              <w:t xml:space="preserve">95.83%</w:t>
             </w:r>
           </w:p>
         </w:tc>
@@ -2171,7 +2195,7 @@
                 <w:sz w:val="19"/>
                 <w:szCs w:val="19"/>
               </w:rPr>
-              <w:t xml:space="preserve">95.80%</w:t>
+              <w:t xml:space="preserve">95.69%</w:t>
             </w:r>
           </w:p>
         </w:tc>
@@ -2721,7 +2745,7 @@
                 <w:sz w:val="19"/>
                 <w:szCs w:val="19"/>
               </w:rPr>
-              <w:t xml:space="preserve">95.26%</w:t>
+              <w:t xml:space="preserve">95.09%</w:t>
             </w:r>
           </w:p>
         </w:tc>
@@ -2746,7 +2770,7 @@
                 <w:sz w:val="19"/>
                 <w:szCs w:val="19"/>
               </w:rPr>
-              <w:t xml:space="preserve">87.24%</w:t>
+              <w:t xml:space="preserve">86.63%</w:t>
             </w:r>
           </w:p>
         </w:tc>
@@ -2771,7 +2795,7 @@
                 <w:sz w:val="19"/>
                 <w:szCs w:val="19"/>
               </w:rPr>
-              <w:t xml:space="preserve">93.12%</w:t>
+              <w:t xml:space="preserve">93.95%</w:t>
             </w:r>
           </w:p>
         </w:tc>
@@ -2796,7 +2820,7 @@
                 <w:sz w:val="19"/>
                 <w:szCs w:val="19"/>
               </w:rPr>
-              <w:t xml:space="preserve">95.65%</w:t>
+              <w:t xml:space="preserve">95.37%</w:t>
             </w:r>
           </w:p>
         </w:tc>
@@ -2832,10 +2856,10 @@
           <w:b/>
           <w:bCs/>
         </w:rPr>
-        <w:t xml:space="preserve">• Phase 3 — Supabase Data Integration: </w:t>
-      </w:r>
-      <w:r>
-        <w:t xml:space="preserve">Build domain API services for schedules, problem statements, teams, and evaluations in src/features/&lt;feature&gt;/api/, exposed via TanStack Query custom hooks and strictly validated through Zod schemas.
+        <w:t xml:space="preserve">• Phase 3 — Problem Statements &amp; Track Releases [COMPLETE]: </w:t>
+      </w:r>
+      <w:r>
+        <w:t xml:space="preserve">Released problem statement listings, time-locked release countdown with auto-transition, safe Markdown renderer with XSS prevention, and detail view.
 </w:t>
       </w:r>
       <w:r>
@@ -2843,10 +2867,10 @@
           <w:b/>
           <w:bCs/>
         </w:rPr>
-        <w:t xml:space="preserve">• Phase 4 — Real-Time WebSocket Feeds: </w:t>
-      </w:r>
-      <w:r>
-        <w:t xml:space="preserve">Subscribe to Supabase Realtime channels for instant score calculation, leaderboard updates, and emergency hackathon announcements.
+        <w:t xml:space="preserve">• Phase 4 — Real-Time Leaderboard: </w:t>
+      </w:r>
+      <w:r>
+        <w:t xml:space="preserve">Build podium top 3 display, round-based evaluation filter, tie handling, and live score sync via Supabase Realtime.
 </w:t>
       </w:r>
       <w:r>
@@ -2854,10 +2878,10 @@
           <w:b/>
           <w:bCs/>
         </w:rPr>
-        <w:t xml:space="preserve">• Phase 5 — Offline Caching &amp; Interactive Campus Maps: </w:t>
-      </w:r>
-      <w:r>
-        <w:t xml:space="preserve">Integrate react-native-maps with indoor campus coordinates, caching schedule data locally via NetInfo + AsyncStorage for resilient offline access.
+        <w:t xml:space="preserve">• Phase 5 — Offline Caching &amp; Transit Route Navigation: </w:t>
+      </w:r>
+      <w:r>
+        <w:t xml:space="preserve">Campus bus route schedules, stops, and polyline route mapping with offline resilience.
 </w:t>
       </w:r>
       <w:r>
@@ -2868,7 +2892,7 @@
         <w:t xml:space="preserve">• Phase 6 — Production Cloud Builds &amp; EAS: </w:t>
       </w:r>
       <w:r>
-        <w:t xml:space="preserve">Execute automated EAS builds with release profiles for Google Play Internal App Sharing and iOS TestFlight.</w:t>
+        <w:t xml:space="preserve">Execute automated EAS builds with release profiles for Google Play and iOS TestFlight.</w:t>
       </w:r>
     </w:p>
     <w:sectPr>

</xml_diff>